<commit_message>
S.D. Ga. bankruptcy adversary complaint: typst and docx on the shared cross-engine layout model, Times New Roman on both (24 pt body pitch as before, 13.8 pt single lines, 12 pt footnotes in 13.8 pt boxes, 11 pt page number); make-reference.sh and reference.docx give way to docx/reference.xml (base="xengine", {font}, footnote recipe, Body Text Note, 11 pt footer); gasb-adversary-complaint.lua writes the caption, title, headings and signature with xe spacing and leaves body paragraphs and footnotes to pandoc; numbered paragraphs as filed (number half an inch in, text an inch in). docx was EB Garamond (DEF-FONT-002, TNR-EMBEDDED failed): now 0 failed; XENG-001..003 pass (196/196 lines), params.cross_engine: gate; typst 9 and docx 13 passed, 0 failed (fb-595.68.12) (its make-reference.sh and reference.docx deletions went in with ba3999ce9, a shared index) (fb-595.68.12)
</commit_message>
<xml_diff>
--- a/courts/eleventh-circuit/georgia/federal/bankruptcy-southern-district/adversary-complaint/usage/OUTPUT-adversary-complaint.docx
+++ b/courts/eleventh-circuit/georgia/federal/bankruptcy-southern-district/adversary-complaint/usage/OUTPUT-adversary-complaint.docx
@@ -4,195 +4,175 @@
   <w:body>
     <w:p>
       <w:pPr>
-        <w:spacing w:before="0" w:after="480" w:line="240" w:lineRule="auto"/>
+        <w:spacing w:before="0" w:after="0" w:line="276" w:lineRule="exact"/>
+        <w:ind w:left="0" w:firstLine="0"/>
         <w:jc w:val="center"/>
       </w:pPr>
       <w:r>
         <w:rPr>
           <w:b/>
           <w:bCs/>
-          <w:caps/>
-        </w:rPr>
-        <w:t xml:space="preserve">United</w:t>
-      </w:r>
-      <w:r>
-        <w:rPr>
-          <w:b/>
-          <w:bCs/>
-          <w:caps/>
-        </w:rPr>
-        <w:t xml:space="preserve"> </w:t>
-      </w:r>
-      <w:r>
-        <w:rPr>
-          <w:b/>
-          <w:bCs/>
-          <w:caps/>
-        </w:rPr>
-        <w:t xml:space="preserve">States</w:t>
-      </w:r>
-      <w:r>
-        <w:rPr>
-          <w:b/>
-          <w:bCs/>
-          <w:caps/>
-        </w:rPr>
-        <w:t xml:space="preserve"> </w:t>
-      </w:r>
-      <w:r>
-        <w:rPr>
-          <w:b/>
-          <w:bCs/>
-          <w:caps/>
-        </w:rPr>
-        <w:t xml:space="preserve">Bankruptcy</w:t>
-      </w:r>
-      <w:r>
-        <w:rPr>
-          <w:b/>
-          <w:bCs/>
-          <w:caps/>
-        </w:rPr>
-        <w:t xml:space="preserve"> </w:t>
-      </w:r>
-      <w:r>
-        <w:rPr>
-          <w:b/>
-          <w:bCs/>
-          <w:caps/>
-        </w:rPr>
-        <w:t xml:space="preserve">Court</w:t>
-      </w:r>
-      <w:r>
-        <w:br/>
-      </w:r>
-      <w:r>
-        <w:rPr>
-          <w:b/>
-          <w:bCs/>
-          <w:caps/>
-        </w:rPr>
-        <w:t xml:space="preserve">for</w:t>
-      </w:r>
-      <w:r>
-        <w:rPr>
-          <w:b/>
-          <w:bCs/>
-          <w:caps/>
-        </w:rPr>
-        <w:t xml:space="preserve"> </w:t>
-      </w:r>
-      <w:r>
-        <w:rPr>
-          <w:b/>
-          <w:bCs/>
-          <w:caps/>
-        </w:rPr>
-        <w:t xml:space="preserve">the</w:t>
-      </w:r>
-      <w:r>
-        <w:rPr>
-          <w:b/>
-          <w:bCs/>
-          <w:caps/>
-        </w:rPr>
-        <w:t xml:space="preserve"> </w:t>
-      </w:r>
-      <w:r>
-        <w:rPr>
-          <w:b/>
-          <w:bCs/>
-          <w:caps/>
-        </w:rPr>
-        <w:t xml:space="preserve">Southern</w:t>
-      </w:r>
-      <w:r>
-        <w:rPr>
-          <w:b/>
-          <w:bCs/>
-          <w:caps/>
-        </w:rPr>
-        <w:t xml:space="preserve"> </w:t>
-      </w:r>
-      <w:r>
-        <w:rPr>
-          <w:b/>
-          <w:bCs/>
-          <w:caps/>
-        </w:rPr>
-        <w:t xml:space="preserve">District</w:t>
-      </w:r>
-      <w:r>
-        <w:rPr>
-          <w:b/>
-          <w:bCs/>
-          <w:caps/>
-        </w:rPr>
-        <w:t xml:space="preserve"> </w:t>
-      </w:r>
-      <w:r>
-        <w:rPr>
-          <w:b/>
-          <w:bCs/>
-          <w:caps/>
-        </w:rPr>
-        <w:t xml:space="preserve">of</w:t>
-      </w:r>
-      <w:r>
-        <w:rPr>
-          <w:b/>
-          <w:bCs/>
-          <w:caps/>
-        </w:rPr>
-        <w:t xml:space="preserve"> </w:t>
-      </w:r>
-      <w:r>
-        <w:rPr>
-          <w:b/>
-          <w:bCs/>
-          <w:caps/>
-        </w:rPr>
-        <w:t xml:space="preserve">Georgia</w:t>
-      </w:r>
-      <w:r>
-        <w:br/>
-      </w:r>
-      <w:r>
-        <w:rPr>
-          <w:b/>
-          <w:bCs/>
-          <w:caps/>
-        </w:rPr>
-        <w:t xml:space="preserve">Savannah</w:t>
-      </w:r>
-      <w:r>
-        <w:rPr>
-          <w:b/>
-          <w:bCs/>
-          <w:caps/>
-        </w:rPr>
-        <w:t xml:space="preserve"> </w:t>
-      </w:r>
-      <w:r>
-        <w:rPr>
-          <w:b/>
-          <w:bCs/>
-          <w:caps/>
-        </w:rPr>
-        <w:t xml:space="preserve">Division</w:t>
+        </w:rPr>
+        <w:t xml:space="preserve">UNITED</w:t>
+      </w:r>
+      <w:r>
+        <w:rPr>
+          <w:b/>
+          <w:bCs/>
+        </w:rPr>
+        <w:t xml:space="preserve"> </w:t>
+      </w:r>
+      <w:r>
+        <w:rPr>
+          <w:b/>
+          <w:bCs/>
+        </w:rPr>
+        <w:t xml:space="preserve">STATES</w:t>
+      </w:r>
+      <w:r>
+        <w:rPr>
+          <w:b/>
+          <w:bCs/>
+        </w:rPr>
+        <w:t xml:space="preserve"> </w:t>
+      </w:r>
+      <w:r>
+        <w:rPr>
+          <w:b/>
+          <w:bCs/>
+        </w:rPr>
+        <w:t xml:space="preserve">BANKRUPTCY</w:t>
+      </w:r>
+      <w:r>
+        <w:rPr>
+          <w:b/>
+          <w:bCs/>
+        </w:rPr>
+        <w:t xml:space="preserve"> </w:t>
+      </w:r>
+      <w:r>
+        <w:rPr>
+          <w:b/>
+          <w:bCs/>
+        </w:rPr>
+        <w:t xml:space="preserve">COURT</w:t>
+      </w:r>
+    </w:p>
+    <w:p>
+      <w:pPr>
+        <w:spacing w:before="0" w:after="0" w:line="276" w:lineRule="exact"/>
+        <w:ind w:left="0" w:firstLine="0"/>
+        <w:jc w:val="center"/>
+      </w:pPr>
+      <w:r>
+        <w:rPr>
+          <w:b/>
+          <w:bCs/>
+        </w:rPr>
+        <w:t xml:space="preserve">FOR</w:t>
+      </w:r>
+      <w:r>
+        <w:rPr>
+          <w:b/>
+          <w:bCs/>
+        </w:rPr>
+        <w:t xml:space="preserve"> </w:t>
+      </w:r>
+      <w:r>
+        <w:rPr>
+          <w:b/>
+          <w:bCs/>
+        </w:rPr>
+        <w:t xml:space="preserve">THE</w:t>
+      </w:r>
+      <w:r>
+        <w:rPr>
+          <w:b/>
+          <w:bCs/>
+        </w:rPr>
+        <w:t xml:space="preserve"> </w:t>
+      </w:r>
+      <w:r>
+        <w:rPr>
+          <w:b/>
+          <w:bCs/>
+        </w:rPr>
+        <w:t xml:space="preserve">SOUTHERN</w:t>
+      </w:r>
+      <w:r>
+        <w:rPr>
+          <w:b/>
+          <w:bCs/>
+        </w:rPr>
+        <w:t xml:space="preserve"> </w:t>
+      </w:r>
+      <w:r>
+        <w:rPr>
+          <w:b/>
+          <w:bCs/>
+        </w:rPr>
+        <w:t xml:space="preserve">DISTRICT</w:t>
+      </w:r>
+      <w:r>
+        <w:rPr>
+          <w:b/>
+          <w:bCs/>
+        </w:rPr>
+        <w:t xml:space="preserve"> </w:t>
+      </w:r>
+      <w:r>
+        <w:rPr>
+          <w:b/>
+          <w:bCs/>
+        </w:rPr>
+        <w:t xml:space="preserve">OF</w:t>
+      </w:r>
+      <w:r>
+        <w:rPr>
+          <w:b/>
+          <w:bCs/>
+        </w:rPr>
+        <w:t xml:space="preserve"> </w:t>
+      </w:r>
+      <w:r>
+        <w:rPr>
+          <w:b/>
+          <w:bCs/>
+        </w:rPr>
+        <w:t xml:space="preserve">GEORGIA</w:t>
+      </w:r>
+    </w:p>
+    <w:p>
+      <w:pPr>
+        <w:spacing w:before="0" w:after="480" w:line="276" w:lineRule="exact"/>
+        <w:ind w:left="0" w:firstLine="0"/>
+        <w:jc w:val="center"/>
+      </w:pPr>
+      <w:r>
+        <w:rPr>
+          <w:b/>
+          <w:bCs/>
+        </w:rPr>
+        <w:t xml:space="preserve">SAVANNAH</w:t>
+      </w:r>
+      <w:r>
+        <w:rPr>
+          <w:b/>
+          <w:bCs/>
+        </w:rPr>
+        <w:t xml:space="preserve"> </w:t>
+      </w:r>
+      <w:r>
+        <w:rPr>
+          <w:b/>
+          <w:bCs/>
+        </w:rPr>
+        <w:t xml:space="preserve">DIVISION</w:t>
       </w:r>
     </w:p>
     <w:tbl>
       <w:tblPr>
         <w:tblW w:w="9360" w:type="dxa"/>
-        <w:tblBorders>
-          <w:top w:val="nil"/>
-          <w:left w:val="nil"/>
-          <w:bottom w:val="nil"/>
-          <w:right w:val="nil"/>
-          <w:insideH w:val="nil"/>
-          <w:insideV w:val="nil"/>
-        </w:tblBorders>
         <w:tblLayout w:type="fixed"/>
         <w:tblCellMar>
           <w:top w:w="0" w:type="dxa"/>
@@ -200,29 +180,29 @@
           <w:bottom w:w="0" w:type="dxa"/>
           <w:right w:w="0" w:type="dxa"/>
         </w:tblCellMar>
+        <w:tblLook w:val="0000" w:firstRow="0" w:lastRow="0" w:firstColumn="0" w:lastColumn="0" w:noHBand="0" w:noVBand="0"/>
       </w:tblPr>
       <w:tblGrid>
-        <w:gridCol w:w="5897"/>
-        <w:gridCol w:w="3463"/>
+        <w:gridCol w:w="5904"/>
+        <w:gridCol w:w="3456"/>
       </w:tblGrid>
       <w:tr>
         <w:tc>
           <w:tcPr>
-            <w:tcW w:w="5897" w:type="dxa"/>
+            <w:tcW w:w="5904" w:type="dxa"/>
             <w:tcBorders>
               <w:bottom w:val="single" w:sz="6" w:space="0" w:color="000000"/>
               <w:right w:val="single" w:sz="6" w:space="0" w:color="000000"/>
             </w:tcBorders>
             <w:tcMar>
-              <w:top w:w="0" w:type="dxa"/>
-              <w:left w:w="0" w:type="dxa"/>
-              <w:bottom w:w="260" w:type="dxa"/>
-              <w:right w:w="312" w:type="dxa"/>
+              <w:right w:w="288" w:type="dxa"/>
             </w:tcMar>
           </w:tcPr>
           <w:p>
             <w:pPr>
-              <w:spacing w:before="0" w:after="0" w:line="240" w:lineRule="auto"/>
+              <w:spacing w:before="0" w:after="0" w:line="276" w:lineRule="exact"/>
+              <w:ind w:left="0" w:firstLine="0"/>
+              <w:jc w:val="left"/>
             </w:pPr>
             <w:r>
               <w:t xml:space="preserve">In</w:t>
@@ -232,235 +212,247 @@
             </w:r>
             <w:r>
               <w:t xml:space="preserve">re:</w:t>
-            </w:r>
-            <w:r>
-              <w:br/>
-            </w:r>
-            <w:r>
-              <w:t xml:space="preserve">MASTER</w:t>
-            </w:r>
-            <w:r>
-              <w:t xml:space="preserve"> </w:t>
-            </w:r>
-            <w:r>
-              <w:t xml:space="preserve">LENDING</w:t>
-            </w:r>
-            <w:r>
-              <w:t xml:space="preserve"> </w:t>
-            </w:r>
-            <w:r>
-              <w:t xml:space="preserve">GROUP,</w:t>
-            </w:r>
-            <w:r>
-              <w:t xml:space="preserve"> </w:t>
-            </w:r>
-            <w:r>
-              <w:t xml:space="preserve">LLC,</w:t>
             </w:r>
           </w:p>
           <w:p>
             <w:pPr>
-              <w:spacing w:before="0" w:after="240" w:line="240" w:lineRule="auto"/>
-              <w:ind w:left="1728" w:firstLine="0"/>
+              <w:spacing w:before="0" w:after="0" w:line="276" w:lineRule="exact"/>
+              <w:ind w:left="0" w:firstLine="0"/>
+              <w:jc w:val="left"/>
             </w:pPr>
             <w:r>
-              <w:t xml:space="preserve">Debtor.</w:t>
+              <w:t xml:space="preserve">MASTER</w:t>
+            </w:r>
+            <w:r>
+              <w:t xml:space="preserve"> </w:t>
+            </w:r>
+            <w:r>
+              <w:t xml:space="preserve">LENDING</w:t>
+            </w:r>
+            <w:r>
+              <w:t xml:space="preserve"> </w:t>
+            </w:r>
+            <w:r>
+              <w:t xml:space="preserve">GROUP,</w:t>
+            </w:r>
+            <w:r>
+              <w:t xml:space="preserve"> </w:t>
+            </w:r>
+            <w:r>
+              <w:t xml:space="preserve">LLC,</w:t>
             </w:r>
           </w:p>
           <w:p>
             <w:pPr>
-              <w:spacing w:before="0" w:after="0" w:line="240" w:lineRule="auto"/>
+              <w:spacing w:before="0" w:after="240" w:line="276" w:lineRule="exact"/>
+              <w:ind w:left="1728" w:firstLine="0"/>
+              <w:jc w:val="left"/>
             </w:pPr>
             <w:r>
-              <w:t xml:space="preserve">TIFFANY</w:t>
-            </w:r>
-            <w:r>
-              <w:t xml:space="preserve"> </w:t>
-            </w:r>
-            <w:r>
-              <w:t xml:space="preserve">E.</w:t>
-            </w:r>
-            <w:r>
-              <w:t xml:space="preserve"> </w:t>
-            </w:r>
-            <w:r>
-              <w:t xml:space="preserve">CARON,</w:t>
-            </w:r>
-            <w:r>
-              <w:t xml:space="preserve"> </w:t>
-            </w:r>
-            <w:r>
-              <w:t xml:space="preserve">CHAPTER</w:t>
-            </w:r>
-            <w:r>
-              <w:t xml:space="preserve"> </w:t>
-            </w:r>
-            <w:r>
-              <w:t xml:space="preserve">7</w:t>
-            </w:r>
-            <w:r>
-              <w:t xml:space="preserve"> </w:t>
-            </w:r>
-            <w:r>
-              <w:t xml:space="preserve">TRUSTEE</w:t>
-            </w:r>
-            <w:r>
-              <w:t xml:space="preserve"> </w:t>
-            </w:r>
-            <w:r>
-              <w:t xml:space="preserve">FOR</w:t>
-            </w:r>
-            <w:r>
-              <w:t xml:space="preserve"> </w:t>
-            </w:r>
-            <w:r>
-              <w:t xml:space="preserve">THE</w:t>
-            </w:r>
-            <w:r>
-              <w:t xml:space="preserve"> </w:t>
-            </w:r>
-            <w:r>
-              <w:t xml:space="preserve">BANKRUPTCY</w:t>
-            </w:r>
-            <w:r>
-              <w:t xml:space="preserve"> </w:t>
-            </w:r>
-            <w:r>
-              <w:t xml:space="preserve">ESTATE</w:t>
-            </w:r>
-            <w:r>
-              <w:t xml:space="preserve"> </w:t>
-            </w:r>
-            <w:r>
-              <w:t xml:space="preserve">OF</w:t>
-            </w:r>
-            <w:r>
-              <w:t xml:space="preserve"> </w:t>
-            </w:r>
-            <w:r>
-              <w:t xml:space="preserve">MASTER</w:t>
-            </w:r>
-            <w:r>
-              <w:t xml:space="preserve"> </w:t>
-            </w:r>
-            <w:r>
-              <w:t xml:space="preserve">LENDING</w:t>
-            </w:r>
-            <w:r>
-              <w:t xml:space="preserve"> </w:t>
-            </w:r>
-            <w:r>
-              <w:t xml:space="preserve">GROUP,</w:t>
-            </w:r>
-            <w:r>
-              <w:t xml:space="preserve"> </w:t>
-            </w:r>
-            <w:r>
-              <w:t xml:space="preserve">LLC,</w:t>
+              <w:t xml:space="preserve">Debtor.</w:t>
             </w:r>
           </w:p>
           <w:p>
             <w:pPr>
-              <w:spacing w:before="0" w:after="240" w:line="240" w:lineRule="auto"/>
-              <w:ind w:left="2592" w:firstLine="0"/>
+              <w:spacing w:before="0" w:after="0" w:line="276" w:lineRule="exact"/>
+              <w:ind w:left="0" w:firstLine="0"/>
+              <w:jc w:val="left"/>
             </w:pPr>
             <w:r>
-              <w:t xml:space="preserve">Plaintiff,</w:t>
+              <w:t xml:space="preserve">TIFFANY</w:t>
+            </w:r>
+            <w:r>
+              <w:t xml:space="preserve"> </w:t>
+            </w:r>
+            <w:r>
+              <w:t xml:space="preserve">E.</w:t>
+            </w:r>
+            <w:r>
+              <w:t xml:space="preserve"> </w:t>
+            </w:r>
+            <w:r>
+              <w:t xml:space="preserve">CARON,</w:t>
+            </w:r>
+            <w:r>
+              <w:t xml:space="preserve"> </w:t>
+            </w:r>
+            <w:r>
+              <w:t xml:space="preserve">CHAPTER</w:t>
+            </w:r>
+            <w:r>
+              <w:t xml:space="preserve"> </w:t>
+            </w:r>
+            <w:r>
+              <w:t xml:space="preserve">7</w:t>
+            </w:r>
+            <w:r>
+              <w:t xml:space="preserve"> </w:t>
+            </w:r>
+            <w:r>
+              <w:t xml:space="preserve">TRUSTEE</w:t>
+            </w:r>
+            <w:r>
+              <w:t xml:space="preserve"> </w:t>
+            </w:r>
+            <w:r>
+              <w:t xml:space="preserve">FOR</w:t>
+            </w:r>
+            <w:r>
+              <w:t xml:space="preserve"> </w:t>
+            </w:r>
+            <w:r>
+              <w:t xml:space="preserve">THE</w:t>
+            </w:r>
+            <w:r>
+              <w:t xml:space="preserve"> </w:t>
+            </w:r>
+            <w:r>
+              <w:t xml:space="preserve">BANKRUPTCY</w:t>
+            </w:r>
+            <w:r>
+              <w:t xml:space="preserve"> </w:t>
+            </w:r>
+            <w:r>
+              <w:t xml:space="preserve">ESTATE</w:t>
+            </w:r>
+            <w:r>
+              <w:t xml:space="preserve"> </w:t>
+            </w:r>
+            <w:r>
+              <w:t xml:space="preserve">OF</w:t>
+            </w:r>
+            <w:r>
+              <w:t xml:space="preserve"> </w:t>
+            </w:r>
+            <w:r>
+              <w:t xml:space="preserve">MASTER</w:t>
+            </w:r>
+            <w:r>
+              <w:t xml:space="preserve"> </w:t>
+            </w:r>
+            <w:r>
+              <w:t xml:space="preserve">LENDING</w:t>
+            </w:r>
+            <w:r>
+              <w:t xml:space="preserve"> </w:t>
+            </w:r>
+            <w:r>
+              <w:t xml:space="preserve">GROUP,</w:t>
+            </w:r>
+            <w:r>
+              <w:t xml:space="preserve"> </w:t>
+            </w:r>
+            <w:r>
+              <w:t xml:space="preserve">LLC,</w:t>
             </w:r>
           </w:p>
           <w:p>
             <w:pPr>
-              <w:spacing w:before="0" w:after="240" w:line="240" w:lineRule="auto"/>
-              <w:jc w:val="center"/>
+              <w:spacing w:before="0" w:after="0" w:line="276" w:lineRule="exact"/>
+              <w:ind w:left="2592" w:firstLine="0"/>
+              <w:jc w:val="left"/>
             </w:pPr>
             <w:r>
-              <w:t xml:space="preserve">v.</w:t>
+              <w:t xml:space="preserve">Plaintiff,</w:t>
             </w:r>
           </w:p>
           <w:p>
             <w:pPr>
-              <w:spacing w:before="0" w:after="0" w:line="240" w:lineRule="auto"/>
+              <w:spacing w:before="240" w:after="240" w:line="276" w:lineRule="exact"/>
+              <w:ind w:left="0" w:firstLine="0"/>
+              <w:jc w:val="center"/>
             </w:pPr>
             <w:r>
-              <w:t xml:space="preserve">SYNERGY</w:t>
-            </w:r>
-            <w:r>
-              <w:t xml:space="preserve"> </w:t>
-            </w:r>
-            <w:r>
-              <w:t xml:space="preserve">HOMES</w:t>
-            </w:r>
-            <w:r>
-              <w:t xml:space="preserve"> </w:t>
-            </w:r>
-            <w:r>
-              <w:t xml:space="preserve">OF</w:t>
-            </w:r>
-            <w:r>
-              <w:t xml:space="preserve"> </w:t>
-            </w:r>
-            <w:r>
-              <w:t xml:space="preserve">GEORGIA,</w:t>
-            </w:r>
-            <w:r>
-              <w:t xml:space="preserve"> </w:t>
-            </w:r>
-            <w:r>
-              <w:t xml:space="preserve">LLC,</w:t>
-            </w:r>
-            <w:r>
-              <w:t xml:space="preserve"> </w:t>
-            </w:r>
-            <w:r>
-              <w:t xml:space="preserve">SYNERGY</w:t>
-            </w:r>
-            <w:r>
-              <w:t xml:space="preserve"> </w:t>
-            </w:r>
-            <w:r>
-              <w:t xml:space="preserve">DESIGNER</w:t>
-            </w:r>
-            <w:r>
-              <w:t xml:space="preserve"> </w:t>
-            </w:r>
-            <w:r>
-              <w:t xml:space="preserve">HOMES,</w:t>
-            </w:r>
-            <w:r>
-              <w:t xml:space="preserve"> </w:t>
-            </w:r>
-            <w:r>
-              <w:t xml:space="preserve">INC.,</w:t>
-            </w:r>
-            <w:r>
-              <w:t xml:space="preserve"> </w:t>
-            </w:r>
-            <w:r>
-              <w:t xml:space="preserve">and</w:t>
-            </w:r>
-            <w:r>
-              <w:t xml:space="preserve"> </w:t>
-            </w:r>
-            <w:r>
-              <w:t xml:space="preserve">JOHN</w:t>
-            </w:r>
-            <w:r>
-              <w:t xml:space="preserve"> </w:t>
-            </w:r>
-            <w:r>
-              <w:t xml:space="preserve">READ</w:t>
-            </w:r>
-            <w:r>
-              <w:t xml:space="preserve"> </w:t>
-            </w:r>
-            <w:r>
-              <w:t xml:space="preserve">BRENNAN,</w:t>
+              <w:t xml:space="preserve">v.</w:t>
             </w:r>
           </w:p>
           <w:p>
             <w:pPr>
-              <w:spacing w:before="0" w:after="0" w:line="240" w:lineRule="auto"/>
+              <w:spacing w:before="0" w:after="0" w:line="276" w:lineRule="exact"/>
+              <w:ind w:left="0" w:firstLine="0"/>
+              <w:jc w:val="left"/>
+            </w:pPr>
+            <w:r>
+              <w:t xml:space="preserve">SYNERGY</w:t>
+            </w:r>
+            <w:r>
+              <w:t xml:space="preserve"> </w:t>
+            </w:r>
+            <w:r>
+              <w:t xml:space="preserve">HOMES</w:t>
+            </w:r>
+            <w:r>
+              <w:t xml:space="preserve"> </w:t>
+            </w:r>
+            <w:r>
+              <w:t xml:space="preserve">OF</w:t>
+            </w:r>
+            <w:r>
+              <w:t xml:space="preserve"> </w:t>
+            </w:r>
+            <w:r>
+              <w:t xml:space="preserve">GEORGIA,</w:t>
+            </w:r>
+            <w:r>
+              <w:t xml:space="preserve"> </w:t>
+            </w:r>
+            <w:r>
+              <w:t xml:space="preserve">LLC,</w:t>
+            </w:r>
+            <w:r>
+              <w:t xml:space="preserve"> </w:t>
+            </w:r>
+            <w:r>
+              <w:t xml:space="preserve">SYNERGY</w:t>
+            </w:r>
+            <w:r>
+              <w:t xml:space="preserve"> </w:t>
+            </w:r>
+            <w:r>
+              <w:t xml:space="preserve">DESIGNER</w:t>
+            </w:r>
+            <w:r>
+              <w:t xml:space="preserve"> </w:t>
+            </w:r>
+            <w:r>
+              <w:t xml:space="preserve">HOMES,</w:t>
+            </w:r>
+            <w:r>
+              <w:t xml:space="preserve"> </w:t>
+            </w:r>
+            <w:r>
+              <w:t xml:space="preserve">INC.,</w:t>
+            </w:r>
+            <w:r>
+              <w:t xml:space="preserve"> </w:t>
+            </w:r>
+            <w:r>
+              <w:t xml:space="preserve">and</w:t>
+            </w:r>
+            <w:r>
+              <w:t xml:space="preserve"> </w:t>
+            </w:r>
+            <w:r>
+              <w:t xml:space="preserve">JOHN</w:t>
+            </w:r>
+            <w:r>
+              <w:t xml:space="preserve"> </w:t>
+            </w:r>
+            <w:r>
+              <w:t xml:space="preserve">READ</w:t>
+            </w:r>
+            <w:r>
+              <w:t xml:space="preserve"> </w:t>
+            </w:r>
+            <w:r>
+              <w:t xml:space="preserve">BRENNAN,</w:t>
+            </w:r>
+          </w:p>
+          <w:p>
+            <w:pPr>
+              <w:spacing w:before="0" w:after="240" w:line="276" w:lineRule="exact"/>
               <w:ind w:left="2592" w:firstLine="0"/>
+              <w:jc w:val="left"/>
             </w:pPr>
             <w:r>
               <w:t xml:space="preserve">Defendants.</w:t>
@@ -469,45 +461,41 @@
         </w:tc>
         <w:tc>
           <w:tcPr>
-            <w:tcW w:w="3463" w:type="dxa"/>
+            <w:tcW w:w="3456" w:type="dxa"/>
             <w:tcMar>
-              <w:top w:w="78" w:type="dxa"/>
-              <w:left w:w="312" w:type="dxa"/>
-              <w:bottom w:w="0" w:type="dxa"/>
-              <w:right w:w="0" w:type="dxa"/>
+              <w:left w:w="288" w:type="dxa"/>
             </w:tcMar>
           </w:tcPr>
           <w:p>
             <w:pPr>
-              <w:spacing w:before="0" w:after="240" w:line="240" w:lineRule="auto"/>
+              <w:spacing w:before="0" w:after="240" w:line="276" w:lineRule="exact"/>
+              <w:ind w:left="0" w:firstLine="0"/>
+              <w:jc w:val="left"/>
             </w:pPr>
             <w:r>
-              <w:t xml:space="preserve">CASE NO. </w:t>
-            </w:r>
-            <w:r>
-              <w:t xml:space="preserve">23-40569-EJC</w:t>
+              <w:t xml:space="preserve">CASE NO. 23</w:t>
+              <w:noBreakHyphen/>
+              <w:t xml:space="preserve">40569-EJC</w:t>
             </w:r>
           </w:p>
           <w:p>
             <w:pPr>
-              <w:spacing w:before="0" w:after="240" w:line="240" w:lineRule="auto"/>
+              <w:spacing w:before="0" w:after="240" w:line="276" w:lineRule="exact"/>
+              <w:ind w:left="0" w:firstLine="0"/>
+              <w:jc w:val="left"/>
             </w:pPr>
             <w:r>
-              <w:t xml:space="preserve">CHAPTER </w:t>
-            </w:r>
-            <w:r>
-              <w:t xml:space="preserve">7</w:t>
+              <w:t xml:space="preserve">CHAPTER 7</w:t>
             </w:r>
           </w:p>
           <w:p>
             <w:pPr>
-              <w:spacing w:before="0" w:after="0" w:line="240" w:lineRule="auto"/>
+              <w:spacing w:before="0" w:after="0" w:line="276" w:lineRule="exact"/>
+              <w:ind w:left="0" w:firstLine="0"/>
+              <w:jc w:val="left"/>
             </w:pPr>
             <w:r>
-              <w:t xml:space="preserve">ADV. PRO. NO. </w:t>
-            </w:r>
-            <w:r>
-              <w:t xml:space="preserve">___________</w:t>
+              <w:t xml:space="preserve">ADV. PRO. NO. ___________</w:t>
             </w:r>
           </w:p>
         </w:tc>
@@ -515,58 +503,127 @@
     </w:tbl>
     <w:p>
       <w:pPr>
+        <w:spacing w:before="480" w:after="240" w:line="276" w:lineRule="exact"/>
+        <w:ind w:left="0" w:firstLine="0"/>
+        <w:jc w:val="center"/>
+      </w:pPr>
+      <w:r>
+        <w:rPr>
+          <w:b/>
+          <w:bCs/>
+        </w:rPr>
+        <w:t xml:space="preserve">COMPLAINT</w:t>
+      </w:r>
+    </w:p>
+    <w:p>
+      <w:pPr>
+        <w:pStyle w:val="BodyText"/>
+      </w:pPr>
+      <w:r>
+        <w:t xml:space="preserve">COMES NOW, Tiffany E. Caron, (“Plaintiff” or “Trustee”), through counsel, as the Chapter 7 Trustee for the Bankruptcy Estate of Master Lending Group, LLC (“MLG” or “Debtor”) and shows the Court:</w:t>
+      </w:r>
+    </w:p>
+    <w:p>
+      <w:pPr>
         <w:keepNext/>
-        <w:spacing w:before="480" w:after="240" w:line="240" w:lineRule="auto"/>
+        <w:keepLines/>
+        <w:spacing w:before="240" w:after="240" w:line="276" w:lineRule="exact"/>
+        <w:ind w:left="0" w:firstLine="0"/>
         <w:jc w:val="center"/>
-      </w:pPr>
-      <w:r>
-        <w:rPr>
-          <w:b/>
-          <w:bCs/>
-          <w:caps/>
-        </w:rPr>
-        <w:t xml:space="preserve">Complaint</w:t>
-      </w:r>
-    </w:p>
-    <w:p>
-      <w:pPr>
-        <w:pStyle w:val="FirstParagraph"/>
-      </w:pPr>
-      <w:r>
-        <w:t xml:space="preserve">COMES NOW, Tiffany E. Caron, (“Plaintiff” or “Trustee”), through counsel, as the Chapter 7 Trustee for the Bankruptcy Estate of Master Lending Group, LLC (“MLG” or “Debtor”) and shows the Court:</w:t>
-      </w:r>
-    </w:p>
-    <w:p>
-      <w:pPr>
-        <w:pStyle w:val="Heading1"/>
-      </w:pPr>
-      <w:bookmarkStart w:id="9" w:name="_ace10f9f725c04971d32df615f84f11b05e15b4"/>
-      <w:r>
-        <w:t xml:space="preserve">Preliminary Statement</w:t>
-      </w:r>
-      <w:bookmarkEnd w:id="9"/>
-    </w:p>
-    <w:p>
-      <w:pPr>
-        <w:pStyle w:val="FirstParagraph"/>
-      </w:pPr>
-      <w:r>
-        <w:t xml:space="preserve">This adversary proceeding seeks to recover approximately $2.7 million remaining to be paid pursuant to the Joint Stipulation and Settlement Agreement dated January 12, 2024 (“Settlement Agreement”) between Synergy Homes of Georgia, LLC (“SHG”), Synergy Designer Homes, Inc. (“SDH”), and John Read Brennan (“Brennan”) (collectively “Defendants”) and the Trustee for the bankruptcy estate of Debtor, approved by order of the Court on March 11, 2024. (Doc. 235). In support of the Trustee’s Complaint, Plaintiff states the following:</w:t>
-      </w:r>
-    </w:p>
-    <w:p>
-      <w:pPr>
-        <w:pStyle w:val="Heading1"/>
-      </w:pPr>
-      <w:bookmarkStart w:id="10" w:name="_ee8cc3b008487ad8c8f517e206deb603d3552cd"/>
-      <w:r>
-        <w:t xml:space="preserve">PARTIES, JURISDICTION, AND VENUE</w:t>
-      </w:r>
-      <w:bookmarkEnd w:id="10"/>
-    </w:p>
-    <w:p>
-      <w:pPr>
-        <w:pStyle w:val="NumberedParagraph"/>
+        <w:outlineLvl w:val="0"/>
+      </w:pPr>
+      <w:r>
+        <w:rPr>
+          <w:b/>
+          <w:bCs/>
+        </w:rPr>
+        <w:t xml:space="preserve">Preliminary</w:t>
+      </w:r>
+      <w:r>
+        <w:rPr>
+          <w:b/>
+          <w:bCs/>
+        </w:rPr>
+        <w:t xml:space="preserve"> </w:t>
+      </w:r>
+      <w:r>
+        <w:rPr>
+          <w:b/>
+          <w:bCs/>
+        </w:rPr>
+        <w:t xml:space="preserve">Statement</w:t>
+      </w:r>
+    </w:p>
+    <w:p>
+      <w:pPr>
+        <w:pStyle w:val="BodyText"/>
+      </w:pPr>
+      <w:r>
+        <w:t xml:space="preserve">This adversary proceeding seeks to recover approximately $2.7 million remaining to be paid pursuant to the Joint Stipulation and Settlement Agreement dated January 12, 2024 (“Settlement Agreement”) between Synergy Homes of Georgia, LLC (“SHG”), Synergy Designer Homes, Inc. (“SDH”), and John Read Brennan (“Brennan”) (collectively “Defendants”) and the Trustee for the bankruptcy estate of Debtor, approved by order of the Court on March 11, 2024. (Doc. 235). In support of the Trustee’s Complaint, Plaintiff states the following:</w:t>
+      </w:r>
+    </w:p>
+    <w:p>
+      <w:pPr>
+        <w:keepNext/>
+        <w:keepLines/>
+        <w:spacing w:before="240" w:after="240" w:line="276" w:lineRule="exact"/>
+        <w:ind w:left="0" w:firstLine="0"/>
+        <w:jc w:val="center"/>
+        <w:outlineLvl w:val="0"/>
+      </w:pPr>
+      <w:r>
+        <w:rPr>
+          <w:b/>
+          <w:bCs/>
+        </w:rPr>
+        <w:t xml:space="preserve">PARTIES,</w:t>
+      </w:r>
+      <w:r>
+        <w:rPr>
+          <w:b/>
+          <w:bCs/>
+        </w:rPr>
+        <w:t xml:space="preserve"> </w:t>
+      </w:r>
+      <w:r>
+        <w:rPr>
+          <w:b/>
+          <w:bCs/>
+        </w:rPr>
+        <w:t xml:space="preserve">JURISDICTION,</w:t>
+      </w:r>
+      <w:r>
+        <w:rPr>
+          <w:b/>
+          <w:bCs/>
+        </w:rPr>
+        <w:t xml:space="preserve"> </w:t>
+      </w:r>
+      <w:r>
+        <w:rPr>
+          <w:b/>
+          <w:bCs/>
+        </w:rPr>
+        <w:t xml:space="preserve">AND</w:t>
+      </w:r>
+      <w:r>
+        <w:rPr>
+          <w:b/>
+          <w:bCs/>
+        </w:rPr>
+        <w:t xml:space="preserve"> </w:t>
+      </w:r>
+      <w:r>
+        <w:rPr>
+          <w:b/>
+          <w:bCs/>
+        </w:rPr>
+        <w:t xml:space="preserve">VENUE</w:t>
+      </w:r>
+    </w:p>
+    <w:p>
+      <w:pPr>
+        <w:pStyle w:val="BodyText"/>
       </w:pPr>
       <w:r>
         <w:t xml:space="preserve">1.</w:t>
@@ -580,7 +637,7 @@
     </w:p>
     <w:p>
       <w:pPr>
-        <w:pStyle w:val="NumberedParagraph"/>
+        <w:pStyle w:val="BodyText"/>
       </w:pPr>
       <w:r>
         <w:t xml:space="preserve">2.</w:t>
@@ -594,7 +651,7 @@
     </w:p>
     <w:p>
       <w:pPr>
-        <w:pStyle w:val="NumberedParagraph"/>
+        <w:pStyle w:val="BodyText"/>
       </w:pPr>
       <w:r>
         <w:t xml:space="preserve">3.</w:t>
@@ -603,12 +660,18 @@
         <w:tab/>
       </w:r>
       <w:r>
-        <w:t xml:space="preserve">MLG is the debtor in the bankruptcy case bearing Case Number 23-40569-EJC (“Bankruptcy Case”), pending in the United States Bankruptcy Court for the Southern District of Georgia, Savannah Division (“Court”).</w:t>
-      </w:r>
-    </w:p>
-    <w:p>
-      <w:pPr>
-        <w:pStyle w:val="NumberedParagraph"/>
+        <w:t xml:space="preserve">MLG is the debtor in the bankruptcy case bearing Case Number 23</w:t>
+      </w:r>
+      <w:r>
+        <w:noBreakHyphen/>
+      </w:r>
+      <w:r>
+        <w:t xml:space="preserve">40569-EJC (“Bankruptcy Case”), pending in the United States Bankruptcy Court for the Southern District of Georgia, Savannah Division (“Court”).</w:t>
+      </w:r>
+    </w:p>
+    <w:p>
+      <w:pPr>
+        <w:pStyle w:val="BodyText"/>
       </w:pPr>
       <w:r>
         <w:t xml:space="preserve">4.</w:t>
@@ -622,7 +685,7 @@
     </w:p>
     <w:p>
       <w:pPr>
-        <w:pStyle w:val="NumberedParagraph"/>
+        <w:pStyle w:val="BodyText"/>
       </w:pPr>
       <w:r>
         <w:t xml:space="preserve">5.</w:t>
@@ -636,7 +699,7 @@
     </w:p>
     <w:p>
       <w:pPr>
-        <w:pStyle w:val="NumberedParagraph"/>
+        <w:pStyle w:val="BodyText"/>
       </w:pPr>
       <w:r>
         <w:t xml:space="preserve">6.</w:t>
@@ -650,7 +713,7 @@
     </w:p>
     <w:p>
       <w:pPr>
-        <w:pStyle w:val="NumberedParagraph"/>
+        <w:pStyle w:val="BodyText"/>
       </w:pPr>
       <w:r>
         <w:t xml:space="preserve">7.</w:t>
@@ -659,12 +722,12 @@
         <w:tab/>
       </w:r>
       <w:r>
-        <w:t xml:space="preserve">Jurisdiction in this proceeding arises under and pursuant to 28 U.S.C. § 157(b)(2) and § 1334 as well as Rule 7001 of the Rules of Bankruptcy Procedure.</w:t>
-      </w:r>
-    </w:p>
-    <w:p>
-      <w:pPr>
-        <w:pStyle w:val="NumberedParagraph"/>
+        <w:t xml:space="preserve">Jurisdiction in this proceeding arises under and pursuant to 28 U.S.C. § 157(b)⁠(2) and § 1334 as well as Rule 7001 of the Rules of Bankruptcy Procedure.</w:t>
+      </w:r>
+    </w:p>
+    <w:p>
+      <w:pPr>
+        <w:pStyle w:val="BodyText"/>
       </w:pPr>
       <w:r>
         <w:t xml:space="preserve">8.</w:t>
@@ -673,12 +736,12 @@
         <w:tab/>
       </w:r>
       <w:r>
-        <w:t xml:space="preserve">Pursuant to 28 U.S.C. § 157(b)(2), this matter is a core proceeding.</w:t>
-      </w:r>
-    </w:p>
-    <w:p>
-      <w:pPr>
-        <w:pStyle w:val="NumberedParagraph"/>
+        <w:t xml:space="preserve">Pursuant to 28 U.S.C. § 157(b)⁠(2), this matter is a core proceeding.</w:t>
+      </w:r>
+    </w:p>
+    <w:p>
+      <w:pPr>
+        <w:pStyle w:val="BodyText"/>
       </w:pPr>
       <w:r>
         <w:t xml:space="preserve">9.</w:t>
@@ -687,12 +750,12 @@
         <w:tab/>
       </w:r>
       <w:r>
-        <w:t xml:space="preserve">Venue is proper in this Court pursuant to 28 U.S.C. § 1409.</w:t>
-      </w:r>
-    </w:p>
-    <w:p>
-      <w:pPr>
-        <w:pStyle w:val="NumberedParagraph"/>
+        <w:t xml:space="preserve">Venue is proper in this Court pursuant to 28 U.S.C. § 1409.</w:t>
+      </w:r>
+    </w:p>
+    <w:p>
+      <w:pPr>
+        <w:pStyle w:val="BodyText"/>
       </w:pPr>
       <w:r>
         <w:t xml:space="preserve">10.</w:t>
@@ -701,12 +764,12 @@
         <w:tab/>
       </w:r>
       <w:r>
-        <w:t xml:space="preserve">The statutory predicates for relief are 11 U.S.C. § 105, 363, 541, and 542.</w:t>
-      </w:r>
-    </w:p>
-    <w:p>
-      <w:pPr>
-        <w:pStyle w:val="NumberedParagraph"/>
+        <w:t xml:space="preserve">The statutory predicates for relief are 11 U.S.C. § 105, 363, 541, and 542.</w:t>
+      </w:r>
+    </w:p>
+    <w:p>
+      <w:pPr>
+        <w:pStyle w:val="BodyText"/>
       </w:pPr>
       <w:r>
         <w:t xml:space="preserve">11.</w:t>
@@ -715,12 +778,18 @@
         <w:tab/>
       </w:r>
       <w:r>
-        <w:t xml:space="preserve">Plaintiff and Defendants agreed that this Court shall determine “any dispute over this Settlement Agreement” and that the Court “shall retain jurisdiction over the Parties for enforcement of this Settlement Agreement. . .” and that any “action relating to, based upon, or arising from a breach of this Settlement Agreement shall be brought only in the Bankruptcy Court, which shall retain jurisdiction over the subject matter and the Parties for this purpose.” Settlement Agreement ¶¶ 12-13.</w:t>
-      </w:r>
-    </w:p>
-    <w:p>
-      <w:pPr>
-        <w:pStyle w:val="NumberedParagraph"/>
+        <w:t xml:space="preserve">Plaintiff and Defendants agreed that this Court shall determine “any dispute over this Settlement Agreement” and that the Court “shall retain jurisdiction over the Parties for enforcement of this Settlement Agreement. . .” and that any “action relating to, based upon, or arising from a breach of this Settlement Agreement shall be brought only in the Bankruptcy Court, which shall retain jurisdiction over the subject matter and the Parties for this purpose.” Settlement Agreement ¶¶ 12</w:t>
+      </w:r>
+      <w:r>
+        <w:noBreakHyphen/>
+      </w:r>
+      <w:r>
+        <w:t xml:space="preserve">13.</w:t>
+      </w:r>
+    </w:p>
+    <w:p>
+      <w:pPr>
+        <w:pStyle w:val="BodyText"/>
       </w:pPr>
       <w:r>
         <w:t xml:space="preserve">12.</w:t>
@@ -755,22 +824,49 @@
         <w:t xml:space="preserve">See In re Melton</w:t>
       </w:r>
       <w:r>
-        <w:t xml:space="preserve">, 10-89519-WLH, 2013 WL 2382657, at *2 (Bankr. N.D. Ga. May 20, 2013). By consenting in the Settlement Agreement that this Court may enter a final judgment in this Adversary Proceeding, Defendants are not waiving their right to appeal any judgment.</w:t>
-      </w:r>
-    </w:p>
-    <w:p>
-      <w:pPr>
-        <w:pStyle w:val="Heading1"/>
-      </w:pPr>
-      <w:bookmarkStart w:id="11" w:name="_b8e5b8837ccf89115edfee2c48cc11b996d00ec"/>
-      <w:r>
-        <w:t xml:space="preserve">FACTUAL BACKGROUND</w:t>
-      </w:r>
-      <w:bookmarkEnd w:id="11"/>
-    </w:p>
-    <w:p>
-      <w:pPr>
-        <w:pStyle w:val="NumberedParagraph"/>
+        <w:t xml:space="preserve">, 10</w:t>
+      </w:r>
+      <w:r>
+        <w:noBreakHyphen/>
+      </w:r>
+      <w:r>
+        <w:t xml:space="preserve">89519-WLH, 2013 WL 2382657, at *2 (Bankr. N.D. Ga. May 20, 2013). By consenting in the Settlement Agreement that this Court may enter a final judgment in this Adversary Proceeding, Defendants are not waiving their right to appeal any judgment.</w:t>
+      </w:r>
+    </w:p>
+    <w:p>
+      <w:pPr>
+        <w:keepNext/>
+        <w:keepLines/>
+        <w:spacing w:before="240" w:after="240" w:line="276" w:lineRule="exact"/>
+        <w:ind w:left="0" w:firstLine="0"/>
+        <w:jc w:val="center"/>
+        <w:outlineLvl w:val="0"/>
+      </w:pPr>
+      <w:r>
+        <w:rPr>
+          <w:b/>
+          <w:bCs/>
+        </w:rPr>
+        <w:t xml:space="preserve">FACTUAL</w:t>
+      </w:r>
+      <w:r>
+        <w:rPr>
+          <w:b/>
+          <w:bCs/>
+        </w:rPr>
+        <w:t xml:space="preserve"> </w:t>
+      </w:r>
+      <w:r>
+        <w:rPr>
+          <w:b/>
+          <w:bCs/>
+        </w:rPr>
+        <w:t xml:space="preserve">BACKGROUND</w:t>
+      </w:r>
+    </w:p>
+    <w:p>
+      <w:pPr>
+        <w:pStyle w:val="BodyText"/>
       </w:pPr>
       <w:r>
         <w:t xml:space="preserve">13.</w:t>
@@ -784,7 +880,7 @@
     </w:p>
     <w:p>
       <w:pPr>
-        <w:pStyle w:val="NumberedParagraph"/>
+        <w:pStyle w:val="BodyText"/>
       </w:pPr>
       <w:r>
         <w:t xml:space="preserve">14.</w:t>
@@ -798,7 +894,7 @@
     </w:p>
     <w:p>
       <w:pPr>
-        <w:pStyle w:val="NumberedParagraph"/>
+        <w:pStyle w:val="BodyText"/>
       </w:pPr>
       <w:r>
         <w:t xml:space="preserve">15.</w:t>
@@ -812,7 +908,7 @@
     </w:p>
     <w:p>
       <w:pPr>
-        <w:pStyle w:val="NumberedParagraph"/>
+        <w:pStyle w:val="BodyText"/>
       </w:pPr>
       <w:r>
         <w:t xml:space="preserve">16.</w:t>
@@ -826,7 +922,7 @@
     </w:p>
     <w:p>
       <w:pPr>
-        <w:pStyle w:val="NumberedParagraph"/>
+        <w:pStyle w:val="BodyText"/>
       </w:pPr>
       <w:r>
         <w:t xml:space="preserve">17.</w:t>
@@ -835,12 +931,12 @@
         <w:tab/>
       </w:r>
       <w:r>
-        <w:t xml:space="preserve">The Debtor’s Schedule A/B filed with the Petition and Schedules (Doc. 1) lists the following asset: Breach of promissory note claims against Synergy Homes of Georgia, LLC; Synergy Homes of South Carolina, LLC &amp; Affiliates; J. Read Brennan in an “Unknown” Amount (the “Claims”).</w:t>
-      </w:r>
-    </w:p>
-    <w:p>
-      <w:pPr>
-        <w:pStyle w:val="NumberedParagraph"/>
+        <w:t xml:space="preserve">The Debtor’s Schedule A/​B filed with the Petition and Schedules (Doc. 1) lists the following asset: Breach of promissory note claims against Synergy Homes of Georgia, LLC; Synergy Homes of South Carolina, LLC &amp; Affiliates; J. Read Brennan in an “Unknown” Amount (the “Claims”).</w:t>
+      </w:r>
+    </w:p>
+    <w:p>
+      <w:pPr>
+        <w:pStyle w:val="BodyText"/>
       </w:pPr>
       <w:r>
         <w:t xml:space="preserve">18.</w:t>
@@ -854,7 +950,7 @@
     </w:p>
     <w:p>
       <w:pPr>
-        <w:pStyle w:val="NumberedParagraph"/>
+        <w:pStyle w:val="BodyText"/>
       </w:pPr>
       <w:r>
         <w:t xml:space="preserve">19.</w:t>
@@ -868,7 +964,7 @@
     </w:p>
     <w:p>
       <w:pPr>
-        <w:pStyle w:val="NumberedParagraph"/>
+        <w:pStyle w:val="BodyText"/>
       </w:pPr>
       <w:r>
         <w:t xml:space="preserve">20.</w:t>
@@ -882,7 +978,7 @@
     </w:p>
     <w:p>
       <w:pPr>
-        <w:pStyle w:val="NumberedParagraph"/>
+        <w:pStyle w:val="BodyText"/>
       </w:pPr>
       <w:r>
         <w:t xml:space="preserve">21.</w:t>
@@ -896,7 +992,7 @@
     </w:p>
     <w:p>
       <w:pPr>
-        <w:pStyle w:val="NumberedParagraph"/>
+        <w:pStyle w:val="BodyText"/>
       </w:pPr>
       <w:r>
         <w:t xml:space="preserve">22.</w:t>
@@ -910,7 +1006,7 @@
     </w:p>
     <w:p>
       <w:pPr>
-        <w:pStyle w:val="NumberedParagraph"/>
+        <w:pStyle w:val="BodyText"/>
       </w:pPr>
       <w:r>
         <w:t xml:space="preserve">23.</w:t>
@@ -919,12 +1015,12 @@
         <w:tab/>
       </w:r>
       <w:r>
-        <w:t xml:space="preserve">Special counsel to the Trustee sent Defendants a notice of default on March 26, 2026 notifying them of their defaults pursuant to ¶ 6 of the Settlement Agreement. The notice of default is attached hereto as Exhibit 1.</w:t>
-      </w:r>
-    </w:p>
-    <w:p>
-      <w:pPr>
-        <w:pStyle w:val="NumberedParagraph"/>
+        <w:t xml:space="preserve">Special counsel to the Trustee sent Defendants a notice of default on March 26, 2026 notifying them of their defaults pursuant to ¶ 6 of the Settlement Agreement. The notice of default is attached hereto as Exhibit 1.</w:t>
+      </w:r>
+    </w:p>
+    <w:p>
+      <w:pPr>
+        <w:pStyle w:val="BodyText"/>
       </w:pPr>
       <w:r>
         <w:t xml:space="preserve">24.</w:t>
@@ -938,7 +1034,7 @@
     </w:p>
     <w:p>
       <w:pPr>
-        <w:pStyle w:val="NumberedParagraph"/>
+        <w:pStyle w:val="BodyText"/>
       </w:pPr>
       <w:r>
         <w:t xml:space="preserve">25.</w:t>
@@ -952,7 +1048,7 @@
     </w:p>
     <w:p>
       <w:pPr>
-        <w:pStyle w:val="NumberedParagraph"/>
+        <w:pStyle w:val="BodyTextNote"/>
       </w:pPr>
       <w:r>
         <w:t xml:space="preserve">26.</w:t>
@@ -961,18 +1057,18 @@
         <w:tab/>
       </w:r>
       <w:r>
-        <w:t xml:space="preserve">Upon default and failure to cure, “the Trustee is entitled to demand payment of the full amount due, less any payment made, plus interest thereafter at the rate of twelve (12%) percent per annum and SHG, SDH, and Brennan consent to the entry of a judgment for the default amount payable with post-judgment interest at the greater of twelve (12%) per annum, or the judgment legal rate.” Settlement Agreement ¶ 6. (emphasis added).</w:t>
+        <w:t xml:space="preserve">Upon default and failure to cure, “the Trustee is entitled to demand payment of the full amount due, less any payment made, plus interest thereafter at the rate of twelve (12%) percent per annum and SHG, SDH, and Brennan consent to the entry of a judgment for the default amount payable with post-judgment interest at the greater of twelve (12%) per annum, or the judgment legal rate.” Settlement Agreement ¶ 6. (emphasis added).</w:t>
       </w:r>
       <w:r>
         <w:rPr>
           <w:rStyle w:val="FootnoteReference"/>
         </w:rPr>
-        <w:footnoteReference w:id="12"/>
-      </w:r>
-    </w:p>
-    <w:p>
-      <w:pPr>
-        <w:pStyle w:val="NumberedParagraph"/>
+        <w:footnoteReference w:id="9"/>
+      </w:r>
+    </w:p>
+    <w:p>
+      <w:pPr>
+        <w:pStyle w:val="BodyText"/>
       </w:pPr>
       <w:r>
         <w:t xml:space="preserve">27.</w:t>
@@ -986,7 +1082,7 @@
     </w:p>
     <w:p>
       <w:pPr>
-        <w:pStyle w:val="NumberedParagraph"/>
+        <w:pStyle w:val="BodyText"/>
       </w:pPr>
       <w:r>
         <w:t xml:space="preserve">28.</w:t>
@@ -995,12 +1091,24 @@
         <w:tab/>
       </w:r>
       <w:r>
-        <w:t xml:space="preserve">The Trustee is also entitled to recover her costs of this action and expenses of litigation, including attorney’s fees from the Defendants pursuant to O.C.G.A. § 13-6-11. Notice for attorneys’ fees is hereby given to Defendants.</w:t>
-      </w:r>
-    </w:p>
-    <w:p>
-      <w:pPr>
-        <w:pStyle w:val="NumberedParagraph"/>
+        <w:t xml:space="preserve">The Trustee is also entitled to recover her costs of this action and expenses of litigation, including attorney’s fees from the Defendants pursuant to O.C.G.A. § 13</w:t>
+      </w:r>
+      <w:r>
+        <w:noBreakHyphen/>
+      </w:r>
+      <w:r>
+        <w:t xml:space="preserve">6</w:t>
+      </w:r>
+      <w:r>
+        <w:noBreakHyphen/>
+      </w:r>
+      <w:r>
+        <w:t xml:space="preserve">11. Notice for attorneys’ fees is hereby given to Defendants.</w:t>
+      </w:r>
+    </w:p>
+    <w:p>
+      <w:pPr>
+        <w:pStyle w:val="BodyText"/>
       </w:pPr>
       <w:r>
         <w:t xml:space="preserve">29.</w:t>
@@ -1009,22 +1117,139 @@
         <w:tab/>
       </w:r>
       <w:r>
-        <w:t xml:space="preserve">The Trustee is entitled to a judgment in the amount of at least $2,684,255.03, plus interest at the rate of 12% per annum from the date the Defendants were notified of their default on March 26, 2026, plus costs and attorney’s fees pursuant to O.C.G.A. § 13-6-11, against the Defendants, including Brennan as personal guarantor of the debt of SHG and SDH.</w:t>
-      </w:r>
-    </w:p>
-    <w:p>
-      <w:pPr>
-        <w:pStyle w:val="Heading1"/>
-      </w:pPr>
-      <w:bookmarkStart w:id="13" w:name="_093d0a782e8e9d8bcade40ceea08cd644ecdd37"/>
-      <w:r>
-        <w:t xml:space="preserve">FIRST CLAIM FOR RELIEF: BREACH OF SETTLMENT AGREEMENT</w:t>
-      </w:r>
-      <w:bookmarkEnd w:id="13"/>
-    </w:p>
-    <w:p>
-      <w:pPr>
-        <w:pStyle w:val="NumberedParagraph"/>
+        <w:t xml:space="preserve">The Trustee is entitled to a judgment in the amount of at least $2,684,255.03, plus interest at the rate of 12% per annum from the date the Defendants were notified of their default on March 26, 2026, plus costs and attorney’s fees pursuant to O.C.G.A. § 13</w:t>
+      </w:r>
+      <w:r>
+        <w:noBreakHyphen/>
+      </w:r>
+      <w:r>
+        <w:t xml:space="preserve">6</w:t>
+      </w:r>
+      <w:r>
+        <w:noBreakHyphen/>
+      </w:r>
+      <w:r>
+        <w:t xml:space="preserve">11, against the Defendants, including Brennan as personal guarantor of the debt of SHG and SDH.</w:t>
+      </w:r>
+    </w:p>
+    <w:p>
+      <w:pPr>
+        <w:keepNext/>
+        <w:keepLines/>
+        <w:spacing w:before="240" w:after="240" w:line="276" w:lineRule="exact"/>
+        <w:ind w:left="0" w:firstLine="0"/>
+        <w:jc w:val="center"/>
+        <w:outlineLvl w:val="0"/>
+      </w:pPr>
+      <w:r>
+        <w:rPr>
+          <w:b/>
+          <w:bCs/>
+        </w:rPr>
+        <w:t xml:space="preserve">FIRST</w:t>
+      </w:r>
+      <w:r>
+        <w:rPr>
+          <w:b/>
+          <w:bCs/>
+        </w:rPr>
+        <w:t xml:space="preserve"> </w:t>
+      </w:r>
+      <w:r>
+        <w:rPr>
+          <w:b/>
+          <w:bCs/>
+        </w:rPr>
+        <w:t xml:space="preserve">CLAIM</w:t>
+      </w:r>
+      <w:r>
+        <w:rPr>
+          <w:b/>
+          <w:bCs/>
+        </w:rPr>
+        <w:t xml:space="preserve"> </w:t>
+      </w:r>
+      <w:r>
+        <w:rPr>
+          <w:b/>
+          <w:bCs/>
+        </w:rPr>
+        <w:t xml:space="preserve">FOR</w:t>
+      </w:r>
+      <w:r>
+        <w:rPr>
+          <w:b/>
+          <w:bCs/>
+        </w:rPr>
+        <w:t xml:space="preserve"> </w:t>
+      </w:r>
+      <w:r>
+        <w:rPr>
+          <w:b/>
+          <w:bCs/>
+        </w:rPr>
+        <w:t xml:space="preserve">RELIEF:</w:t>
+      </w:r>
+      <w:r>
+        <w:rPr>
+          <w:b/>
+          <w:bCs/>
+        </w:rPr>
+        <w:t xml:space="preserve"> </w:t>
+      </w:r>
+      <w:r>
+        <w:rPr>
+          <w:b/>
+          <w:bCs/>
+        </w:rPr>
+        <w:t xml:space="preserve">BREACH</w:t>
+      </w:r>
+      <w:r>
+        <w:rPr>
+          <w:b/>
+          <w:bCs/>
+        </w:rPr>
+        <w:t xml:space="preserve"> </w:t>
+      </w:r>
+      <w:r>
+        <w:rPr>
+          <w:b/>
+          <w:bCs/>
+        </w:rPr>
+        <w:t xml:space="preserve">OF</w:t>
+      </w:r>
+      <w:r>
+        <w:rPr>
+          <w:b/>
+          <w:bCs/>
+        </w:rPr>
+        <w:t xml:space="preserve"> </w:t>
+      </w:r>
+      <w:r>
+        <w:rPr>
+          <w:b/>
+          <w:bCs/>
+        </w:rPr>
+        <w:t xml:space="preserve">SETTLMENT</w:t>
+      </w:r>
+      <w:r>
+        <w:rPr>
+          <w:b/>
+          <w:bCs/>
+        </w:rPr>
+        <w:t xml:space="preserve"> </w:t>
+      </w:r>
+      <w:r>
+        <w:rPr>
+          <w:b/>
+          <w:bCs/>
+        </w:rPr>
+        <w:t xml:space="preserve">AGREEMENT</w:t>
+      </w:r>
+    </w:p>
+    <w:p>
+      <w:pPr>
+        <w:pStyle w:val="BodyText"/>
       </w:pPr>
       <w:r>
         <w:t xml:space="preserve">30.</w:t>
@@ -1038,7 +1263,7 @@
     </w:p>
     <w:p>
       <w:pPr>
-        <w:pStyle w:val="NumberedParagraph"/>
+        <w:pStyle w:val="BodyText"/>
       </w:pPr>
       <w:r>
         <w:t xml:space="preserve">31.</w:t>
@@ -1052,7 +1277,7 @@
     </w:p>
     <w:p>
       <w:pPr>
-        <w:pStyle w:val="NumberedParagraph"/>
+        <w:pStyle w:val="BodyText"/>
       </w:pPr>
       <w:r>
         <w:t xml:space="preserve">32.</w:t>
@@ -1066,7 +1291,7 @@
     </w:p>
     <w:p>
       <w:pPr>
-        <w:pStyle w:val="NumberedParagraph"/>
+        <w:pStyle w:val="BodyText"/>
       </w:pPr>
       <w:r>
         <w:t xml:space="preserve">33.</w:t>
@@ -1080,7 +1305,7 @@
     </w:p>
     <w:p>
       <w:pPr>
-        <w:pStyle w:val="NumberedParagraph"/>
+        <w:pStyle w:val="BodyText"/>
       </w:pPr>
       <w:r>
         <w:t xml:space="preserve">34.</w:t>
@@ -1094,7 +1319,7 @@
     </w:p>
     <w:p>
       <w:pPr>
-        <w:pStyle w:val="NumberedParagraph"/>
+        <w:pStyle w:val="BodyText"/>
       </w:pPr>
       <w:r>
         <w:t xml:space="preserve">35.</w:t>
@@ -1108,7 +1333,7 @@
     </w:p>
     <w:p>
       <w:pPr>
-        <w:pStyle w:val="NumberedParagraph"/>
+        <w:pStyle w:val="BodyText"/>
       </w:pPr>
       <w:r>
         <w:t xml:space="preserve">36.</w:t>
@@ -1122,17 +1347,178 @@
     </w:p>
     <w:p>
       <w:pPr>
-        <w:pStyle w:val="Heading1"/>
-      </w:pPr>
-      <w:bookmarkStart w:id="14" w:name="_0c4ec973f50d961ae4194b31e50e6875c123aa7"/>
-      <w:r>
-        <w:t xml:space="preserve">SECOND CLAIM FOR RELIEF: BREACH OF PERSONAL GUARANTY BY JOHN READ BRENNAN</w:t>
-      </w:r>
-      <w:bookmarkEnd w:id="14"/>
-    </w:p>
-    <w:p>
-      <w:pPr>
-        <w:pStyle w:val="NumberedParagraph"/>
+        <w:keepNext/>
+        <w:keepLines/>
+        <w:spacing w:before="240" w:after="240" w:line="276" w:lineRule="exact"/>
+        <w:ind w:left="0" w:firstLine="0"/>
+        <w:jc w:val="center"/>
+        <w:outlineLvl w:val="0"/>
+      </w:pPr>
+      <w:r>
+        <w:rPr>
+          <w:b/>
+          <w:bCs/>
+        </w:rPr>
+        <w:t xml:space="preserve">SECOND</w:t>
+      </w:r>
+      <w:r>
+        <w:rPr>
+          <w:b/>
+          <w:bCs/>
+        </w:rPr>
+        <w:t xml:space="preserve"> </w:t>
+      </w:r>
+      <w:r>
+        <w:rPr>
+          <w:b/>
+          <w:bCs/>
+        </w:rPr>
+        <w:t xml:space="preserve">CLAIM</w:t>
+      </w:r>
+      <w:r>
+        <w:rPr>
+          <w:b/>
+          <w:bCs/>
+        </w:rPr>
+        <w:t xml:space="preserve"> </w:t>
+      </w:r>
+      <w:r>
+        <w:rPr>
+          <w:b/>
+          <w:bCs/>
+        </w:rPr>
+        <w:t xml:space="preserve">FOR</w:t>
+      </w:r>
+      <w:r>
+        <w:rPr>
+          <w:b/>
+          <w:bCs/>
+        </w:rPr>
+        <w:t xml:space="preserve"> </w:t>
+      </w:r>
+      <w:r>
+        <w:rPr>
+          <w:b/>
+          <w:bCs/>
+        </w:rPr>
+        <w:t xml:space="preserve">RELIEF:</w:t>
+      </w:r>
+      <w:r>
+        <w:rPr>
+          <w:b/>
+          <w:bCs/>
+        </w:rPr>
+        <w:t xml:space="preserve"> </w:t>
+      </w:r>
+      <w:r>
+        <w:rPr>
+          <w:b/>
+          <w:bCs/>
+        </w:rPr>
+        <w:t xml:space="preserve">BREACH</w:t>
+      </w:r>
+      <w:r>
+        <w:rPr>
+          <w:b/>
+          <w:bCs/>
+        </w:rPr>
+        <w:t xml:space="preserve"> </w:t>
+      </w:r>
+      <w:r>
+        <w:rPr>
+          <w:b/>
+          <w:bCs/>
+        </w:rPr>
+        <w:t xml:space="preserve">OF</w:t>
+      </w:r>
+      <w:r>
+        <w:rPr>
+          <w:b/>
+          <w:bCs/>
+        </w:rPr>
+        <w:t xml:space="preserve"> </w:t>
+      </w:r>
+      <w:r>
+        <w:rPr>
+          <w:b/>
+          <w:bCs/>
+        </w:rPr>
+        <w:t xml:space="preserve">PERSONAL</w:t>
+      </w:r>
+      <w:r>
+        <w:rPr>
+          <w:b/>
+          <w:bCs/>
+        </w:rPr>
+        <w:t xml:space="preserve"> </w:t>
+      </w:r>
+      <w:r>
+        <w:rPr>
+          <w:b/>
+          <w:bCs/>
+        </w:rPr>
+        <w:t xml:space="preserve">GUARANTY</w:t>
+      </w:r>
+      <w:r>
+        <w:rPr>
+          <w:b/>
+          <w:bCs/>
+        </w:rPr>
+        <w:t xml:space="preserve"> </w:t>
+      </w:r>
+      <w:r>
+        <w:rPr>
+          <w:b/>
+          <w:bCs/>
+        </w:rPr>
+        <w:t xml:space="preserve">BY</w:t>
+      </w:r>
+      <w:r>
+        <w:rPr>
+          <w:b/>
+          <w:bCs/>
+        </w:rPr>
+        <w:t xml:space="preserve"> </w:t>
+      </w:r>
+      <w:r>
+        <w:rPr>
+          <w:b/>
+          <w:bCs/>
+        </w:rPr>
+        <w:t xml:space="preserve">JOHN</w:t>
+      </w:r>
+      <w:r>
+        <w:rPr>
+          <w:b/>
+          <w:bCs/>
+        </w:rPr>
+        <w:t xml:space="preserve"> </w:t>
+      </w:r>
+      <w:r>
+        <w:rPr>
+          <w:b/>
+          <w:bCs/>
+        </w:rPr>
+        <w:t xml:space="preserve">READ</w:t>
+      </w:r>
+      <w:r>
+        <w:rPr>
+          <w:b/>
+          <w:bCs/>
+        </w:rPr>
+        <w:t xml:space="preserve"> </w:t>
+      </w:r>
+      <w:r>
+        <w:rPr>
+          <w:b/>
+          <w:bCs/>
+        </w:rPr>
+        <w:t xml:space="preserve">BRENNAN</w:t>
+      </w:r>
+    </w:p>
+    <w:p>
+      <w:pPr>
+        <w:pStyle w:val="BodyText"/>
       </w:pPr>
       <w:r>
         <w:t xml:space="preserve">37.</w:t>
@@ -1146,7 +1532,7 @@
     </w:p>
     <w:p>
       <w:pPr>
-        <w:pStyle w:val="NumberedParagraph"/>
+        <w:pStyle w:val="BodyText"/>
       </w:pPr>
       <w:r>
         <w:t xml:space="preserve">38.</w:t>
@@ -1160,7 +1546,7 @@
     </w:p>
     <w:p>
       <w:pPr>
-        <w:pStyle w:val="NumberedParagraph"/>
+        <w:pStyle w:val="BodyText"/>
       </w:pPr>
       <w:r>
         <w:t xml:space="preserve">39.</w:t>
@@ -1174,7 +1560,7 @@
     </w:p>
     <w:p>
       <w:pPr>
-        <w:pStyle w:val="NumberedParagraph"/>
+        <w:pStyle w:val="BodyText"/>
       </w:pPr>
       <w:r>
         <w:t xml:space="preserve">40.</w:t>
@@ -1188,7 +1574,7 @@
     </w:p>
     <w:p>
       <w:pPr>
-        <w:pStyle w:val="NumberedParagraph"/>
+        <w:pStyle w:val="BodyText"/>
       </w:pPr>
       <w:r>
         <w:t xml:space="preserve">41.</w:t>
@@ -1197,12 +1583,24 @@
         <w:tab/>
       </w:r>
       <w:r>
-        <w:t xml:space="preserve">Brennan owes the Trustee her costs of this action and expenses of litigation, including attorney’s fees pursuant to O.C.G.A. § 13-6-11.</w:t>
-      </w:r>
-    </w:p>
-    <w:p>
-      <w:pPr>
-        <w:pStyle w:val="NumberedParagraph"/>
+        <w:t xml:space="preserve">Brennan owes the Trustee her costs of this action and expenses of litigation, including attorney’s fees pursuant to O.C.G.A. § 13</w:t>
+      </w:r>
+      <w:r>
+        <w:noBreakHyphen/>
+      </w:r>
+      <w:r>
+        <w:t xml:space="preserve">6</w:t>
+      </w:r>
+      <w:r>
+        <w:noBreakHyphen/>
+      </w:r>
+      <w:r>
+        <w:t xml:space="preserve">11.</w:t>
+      </w:r>
+    </w:p>
+    <w:p>
+      <w:pPr>
+        <w:pStyle w:val="BodyText"/>
       </w:pPr>
       <w:r>
         <w:t xml:space="preserve">42.</w:t>
@@ -1216,17 +1614,122 @@
     </w:p>
     <w:p>
       <w:pPr>
-        <w:pStyle w:val="Heading1"/>
-      </w:pPr>
-      <w:bookmarkStart w:id="15" w:name="_98624c66c1ac733bc79ac80ae924a550eef25da"/>
-      <w:r>
-        <w:t xml:space="preserve">THIRD CLAIM FOR RELIEF: ATTORNEY’S FEES AND COSTS</w:t>
-      </w:r>
-      <w:bookmarkEnd w:id="15"/>
-    </w:p>
-    <w:p>
-      <w:pPr>
-        <w:pStyle w:val="NumberedParagraph"/>
+        <w:keepNext/>
+        <w:keepLines/>
+        <w:spacing w:before="240" w:after="240" w:line="276" w:lineRule="exact"/>
+        <w:ind w:left="0" w:firstLine="0"/>
+        <w:jc w:val="center"/>
+        <w:outlineLvl w:val="0"/>
+      </w:pPr>
+      <w:r>
+        <w:rPr>
+          <w:b/>
+          <w:bCs/>
+        </w:rPr>
+        <w:t xml:space="preserve">THIRD</w:t>
+      </w:r>
+      <w:r>
+        <w:rPr>
+          <w:b/>
+          <w:bCs/>
+        </w:rPr>
+        <w:t xml:space="preserve"> </w:t>
+      </w:r>
+      <w:r>
+        <w:rPr>
+          <w:b/>
+          <w:bCs/>
+        </w:rPr>
+        <w:t xml:space="preserve">CLAIM</w:t>
+      </w:r>
+      <w:r>
+        <w:rPr>
+          <w:b/>
+          <w:bCs/>
+        </w:rPr>
+        <w:t xml:space="preserve"> </w:t>
+      </w:r>
+      <w:r>
+        <w:rPr>
+          <w:b/>
+          <w:bCs/>
+        </w:rPr>
+        <w:t xml:space="preserve">FOR</w:t>
+      </w:r>
+      <w:r>
+        <w:rPr>
+          <w:b/>
+          <w:bCs/>
+        </w:rPr>
+        <w:t xml:space="preserve"> </w:t>
+      </w:r>
+      <w:r>
+        <w:rPr>
+          <w:b/>
+          <w:bCs/>
+        </w:rPr>
+        <w:t xml:space="preserve">RELIEF:</w:t>
+      </w:r>
+      <w:r>
+        <w:rPr>
+          <w:b/>
+          <w:bCs/>
+        </w:rPr>
+        <w:t xml:space="preserve"> </w:t>
+      </w:r>
+      <w:r>
+        <w:rPr>
+          <w:b/>
+          <w:bCs/>
+        </w:rPr>
+        <w:t xml:space="preserve">ATTORNEY’S</w:t>
+      </w:r>
+      <w:r>
+        <w:rPr>
+          <w:b/>
+          <w:bCs/>
+        </w:rPr>
+        <w:t xml:space="preserve"> </w:t>
+      </w:r>
+      <w:r>
+        <w:rPr>
+          <w:b/>
+          <w:bCs/>
+        </w:rPr>
+        <w:t xml:space="preserve">FEES</w:t>
+      </w:r>
+      <w:r>
+        <w:rPr>
+          <w:b/>
+          <w:bCs/>
+        </w:rPr>
+        <w:t xml:space="preserve"> </w:t>
+      </w:r>
+      <w:r>
+        <w:rPr>
+          <w:b/>
+          <w:bCs/>
+        </w:rPr>
+        <w:t xml:space="preserve">AND</w:t>
+      </w:r>
+      <w:r>
+        <w:rPr>
+          <w:b/>
+          <w:bCs/>
+        </w:rPr>
+        <w:t xml:space="preserve"> </w:t>
+      </w:r>
+      <w:r>
+        <w:rPr>
+          <w:b/>
+          <w:bCs/>
+        </w:rPr>
+        <w:t xml:space="preserve">COSTS</w:t>
+      </w:r>
+    </w:p>
+    <w:p>
+      <w:pPr>
+        <w:pStyle w:val="BodyText"/>
       </w:pPr>
       <w:r>
         <w:t xml:space="preserve">43.</w:t>
@@ -1240,7 +1743,7 @@
     </w:p>
     <w:p>
       <w:pPr>
-        <w:pStyle w:val="NumberedParagraph"/>
+        <w:pStyle w:val="BodyText"/>
       </w:pPr>
       <w:r>
         <w:t xml:space="preserve">44.</w:t>
@@ -1249,12 +1752,24 @@
         <w:tab/>
       </w:r>
       <w:r>
-        <w:t xml:space="preserve">The Trustee again hereby makes her demand for payment of the $2,684,255.03 owed under the Settlement Agreement. Upon failure of Defendants to pay the $2,684,255.03, including interest from March 26, 2026, within ten (10) days from the date this Complaint is served upon Defendants, the Trustee will be entitled to attorney’s fees pursuant to O.C.G.A. § 13-6-11.</w:t>
-      </w:r>
-    </w:p>
-    <w:p>
-      <w:pPr>
-        <w:pStyle w:val="NumberedParagraph"/>
+        <w:t xml:space="preserve">The Trustee again hereby makes her demand for payment of the $2,684,255.03 owed under the Settlement Agreement. Upon failure of Defendants to pay the $2,684,255.03, including interest from March 26, 2026, within ten (10) days from the date this Complaint is served upon Defendants, the Trustee will be entitled to attorney’s fees pursuant to O.C.G.A. § 13</w:t>
+      </w:r>
+      <w:r>
+        <w:noBreakHyphen/>
+      </w:r>
+      <w:r>
+        <w:t xml:space="preserve">6</w:t>
+      </w:r>
+      <w:r>
+        <w:noBreakHyphen/>
+      </w:r>
+      <w:r>
+        <w:t xml:space="preserve">11.</w:t>
+      </w:r>
+    </w:p>
+    <w:p>
+      <w:pPr>
+        <w:pStyle w:val="BodyText"/>
       </w:pPr>
       <w:r>
         <w:t xml:space="preserve">45.</w:t>
@@ -1263,12 +1778,24 @@
         <w:tab/>
       </w:r>
       <w:r>
-        <w:t xml:space="preserve">In the actions of Defendants as set forth herein, they have been stubbornly litigious, have acted in bad faith, and have caused the Trustee unnecessary trouble and expense. As a result, Defendants are liable to the Trustee for all attorneys’ fees and expenses of litigation incurred in the prosecution of this action pursuant to O.C.G.A. § 13-6-11.</w:t>
-      </w:r>
-    </w:p>
-    <w:p>
-      <w:pPr>
-        <w:pStyle w:val="NumberedParagraph"/>
+        <w:t xml:space="preserve">In the actions of Defendants as set forth herein, they have been stubbornly litigious, have acted in bad faith, and have caused the Trustee unnecessary trouble and expense. As a result, Defendants are liable to the Trustee for all attorneys’ fees and expenses of litigation incurred in the prosecution of this action pursuant to O.C.G.A. § 13</w:t>
+      </w:r>
+      <w:r>
+        <w:noBreakHyphen/>
+      </w:r>
+      <w:r>
+        <w:t xml:space="preserve">6</w:t>
+      </w:r>
+      <w:r>
+        <w:noBreakHyphen/>
+      </w:r>
+      <w:r>
+        <w:t xml:space="preserve">11.</w:t>
+      </w:r>
+    </w:p>
+    <w:p>
+      <w:pPr>
+        <w:pStyle w:val="BodyText"/>
       </w:pPr>
       <w:r>
         <w:t xml:space="preserve">46.</w:t>
@@ -1277,12 +1804,24 @@
         <w:tab/>
       </w:r>
       <w:r>
-        <w:t xml:space="preserve">Defendants owe the Trustee her costs of this action and expenses of litigation, including attorney’s fees pursuant to O.C.G.A. § 13-6-11.</w:t>
-      </w:r>
-    </w:p>
-    <w:p>
-      <w:pPr>
-        <w:pStyle w:val="NumberedParagraph"/>
+        <w:t xml:space="preserve">Defendants owe the Trustee her costs of this action and expenses of litigation, including attorney’s fees pursuant to O.C.G.A. § 13</w:t>
+      </w:r>
+      <w:r>
+        <w:noBreakHyphen/>
+      </w:r>
+      <w:r>
+        <w:t xml:space="preserve">6</w:t>
+      </w:r>
+      <w:r>
+        <w:noBreakHyphen/>
+      </w:r>
+      <w:r>
+        <w:t xml:space="preserve">11.</w:t>
+      </w:r>
+    </w:p>
+    <w:p>
+      <w:pPr>
+        <w:pStyle w:val="BodyText"/>
       </w:pPr>
       <w:r>
         <w:t xml:space="preserve">47.</w:t>
@@ -1296,7 +1835,7 @@
     </w:p>
     <w:p>
       <w:pPr>
-        <w:pStyle w:val="NumberedParagraph"/>
+        <w:pStyle w:val="BodyText"/>
       </w:pPr>
       <w:r>
         <w:t xml:space="preserve">48.</w:t>
@@ -1310,28 +1849,15 @@
     </w:p>
     <w:p>
       <w:pPr>
-        <w:pStyle w:val="FirstParagraph"/>
+        <w:pStyle w:val="BodyText"/>
       </w:pPr>
       <w:r>
         <w:t xml:space="preserve">WHEREFORE, the Trustee respectfully requests that this Court enter a judgment against Defendants for the sum to be determined by the finder of fact but, in no event, less than $2,684,255.03, interest of twelve percent (12%) per annum from March 26, 2026, plus attorneys’ fees, post-judgment interest of twelve percent (12%) per annum and costs. The Trustee further respectfully requests that such judgment be declared a final judgment.</w:t>
       </w:r>
-    </w:p>
-    <w:p>
-      <w:pPr>
-        <w:spacing w:before="0" w:after="0" w:line="480" w:lineRule="exact"/>
-      </w:pPr>
     </w:p>
     <w:tbl>
       <w:tblPr>
         <w:tblW w:w="9360" w:type="dxa"/>
-        <w:tblBorders>
-          <w:top w:val="nil"/>
-          <w:left w:val="nil"/>
-          <w:bottom w:val="nil"/>
-          <w:right w:val="nil"/>
-          <w:insideH w:val="nil"/>
-          <w:insideV w:val="nil"/>
-        </w:tblBorders>
         <w:tblLayout w:type="fixed"/>
         <w:tblCellMar>
           <w:top w:w="0" w:type="dxa"/>
@@ -1339,19 +1865,25 @@
           <w:bottom w:w="0" w:type="dxa"/>
           <w:right w:w="0" w:type="dxa"/>
         </w:tblCellMar>
+        <w:tblLook w:val="0000" w:firstRow="0" w:lastRow="0" w:firstColumn="0" w:lastColumn="0" w:noHBand="0" w:noVBand="0"/>
       </w:tblPr>
       <w:tblGrid>
         <w:gridCol w:w="4752"/>
         <w:gridCol w:w="4608"/>
       </w:tblGrid>
       <w:tr>
+        <w:trPr>
+          <w:cantSplit/>
+        </w:trPr>
         <w:tc>
           <w:tcPr>
             <w:tcW w:w="4752" w:type="dxa"/>
           </w:tcPr>
           <w:p>
             <w:pPr>
-              <w:spacing w:before="0" w:after="0" w:line="240" w:lineRule="auto"/>
+              <w:spacing w:before="480" w:after="0" w:line="276" w:lineRule="exact"/>
+              <w:ind w:left="0" w:firstLine="0"/>
+              <w:jc w:val="left"/>
             </w:pPr>
             <w:r>
               <w:t xml:space="preserve">Respectfully submitted this </w:t>
@@ -1394,7 +1926,9 @@
           </w:tcPr>
           <w:p>
             <w:pPr>
-              <w:spacing w:before="0" w:after="240" w:line="240" w:lineRule="auto"/>
+              <w:spacing w:before="480" w:after="240" w:line="276" w:lineRule="exact"/>
+              <w:ind w:left="0" w:firstLine="0"/>
+              <w:jc w:val="left"/>
             </w:pPr>
             <w:r>
               <w:rPr>
@@ -1476,134 +2010,181 @@
           </w:p>
           <w:p>
             <w:pPr>
-              <w:spacing w:before="0" w:after="240" w:line="240" w:lineRule="auto"/>
+              <w:spacing w:before="0" w:after="0" w:line="276" w:lineRule="exact"/>
+              <w:ind w:left="0" w:firstLine="0"/>
+              <w:jc w:val="left"/>
             </w:pPr>
             <w:r>
-              <w:t xml:space="preserve">/s/ </w:t>
-            </w:r>
-            <w:r>
-              <w:t xml:space="preserve">Francesca</w:t>
-            </w:r>
-            <w:r>
-              <w:t xml:space="preserve"> </w:t>
-            </w:r>
-            <w:r>
-              <w:t xml:space="preserve">Macchiaverna</w:t>
-            </w:r>
-            <w:r>
-              <w:br/>
-            </w:r>
-            <w:r>
-              <w:t xml:space="preserve">Francesca</w:t>
-            </w:r>
-            <w:r>
-              <w:t xml:space="preserve"> </w:t>
-            </w:r>
-            <w:r>
-              <w:t xml:space="preserve">Macchiaverna</w:t>
-            </w:r>
-            <w:r>
-              <w:br/>
-            </w:r>
-            <w:r>
-              <w:t xml:space="preserve">Georgia</w:t>
-            </w:r>
-            <w:r>
-              <w:t xml:space="preserve"> </w:t>
-            </w:r>
-            <w:r>
-              <w:t xml:space="preserve">Bar</w:t>
-            </w:r>
-            <w:r>
-              <w:t xml:space="preserve"> </w:t>
-            </w:r>
-            <w:r>
-              <w:t xml:space="preserve">No. 462924</w:t>
-            </w:r>
-            <w:r>
-              <w:br/>
-            </w:r>
-            <w:r>
-              <w:t xml:space="preserve">fmacchiaverna@huntermaclean.com</w:t>
+              <w:t xml:space="preserve">/s/ Francesca Macchiaverna</w:t>
             </w:r>
           </w:p>
           <w:p>
             <w:pPr>
-              <w:spacing w:before="0" w:after="240" w:line="240" w:lineRule="auto"/>
+              <w:spacing w:before="0" w:after="0" w:line="276" w:lineRule="exact"/>
+              <w:ind w:left="0" w:firstLine="0"/>
+              <w:jc w:val="left"/>
             </w:pPr>
             <w:r>
-              <w:t xml:space="preserve">Robert</w:t>
-            </w:r>
-            <w:r>
-              <w:t xml:space="preserve"> </w:t>
-            </w:r>
-            <w:r>
-              <w:t xml:space="preserve">Hurst</w:t>
-            </w:r>
-            <w:r>
-              <w:br/>
-            </w:r>
-            <w:r>
-              <w:t xml:space="preserve">Georgia</w:t>
-            </w:r>
-            <w:r>
-              <w:t xml:space="preserve"> </w:t>
-            </w:r>
-            <w:r>
-              <w:t xml:space="preserve">Bar</w:t>
-            </w:r>
-            <w:r>
-              <w:t xml:space="preserve"> </w:t>
-            </w:r>
-            <w:r>
-              <w:t xml:space="preserve">No. 919180</w:t>
-            </w:r>
-            <w:r>
-              <w:br/>
-            </w:r>
-            <w:r>
-              <w:t xml:space="preserve">rhurst@huntermclean.com</w:t>
-            </w:r>
-            <w:r>
-              <w:br/>
-            </w:r>
-            <w:r>
-              <w:t xml:space="preserve">Luckshume</w:t>
-            </w:r>
-            <w:r>
-              <w:t xml:space="preserve"> </w:t>
-            </w:r>
-            <w:r>
-              <w:t xml:space="preserve">Ketheeswaran</w:t>
-            </w:r>
-            <w:r>
-              <w:br/>
-            </w:r>
-            <w:r>
-              <w:t xml:space="preserve">Georgia</w:t>
-            </w:r>
-            <w:r>
-              <w:t xml:space="preserve"> </w:t>
-            </w:r>
-            <w:r>
-              <w:t xml:space="preserve">Bar</w:t>
-            </w:r>
-            <w:r>
-              <w:t xml:space="preserve"> </w:t>
-            </w:r>
-            <w:r>
-              <w:t xml:space="preserve">No. 981388</w:t>
-            </w:r>
-            <w:r>
-              <w:br/>
-            </w:r>
-            <w:r>
-              <w:t xml:space="preserve">lketheeswaran@huntermaclean.com</w:t>
+              <w:t xml:space="preserve">Francesca</w:t>
+            </w:r>
+            <w:r>
+              <w:t xml:space="preserve"> </w:t>
+            </w:r>
+            <w:r>
+              <w:t xml:space="preserve">Macchiaverna</w:t>
             </w:r>
           </w:p>
           <w:p>
             <w:pPr>
-              <w:spacing w:before="0" w:after="0" w:line="240" w:lineRule="auto"/>
+              <w:spacing w:before="0" w:after="0" w:line="276" w:lineRule="exact"/>
+              <w:ind w:left="0" w:firstLine="0"/>
+              <w:jc w:val="left"/>
+            </w:pPr>
+            <w:r>
+              <w:t xml:space="preserve">Georgia</w:t>
+            </w:r>
+            <w:r>
+              <w:t xml:space="preserve"> </w:t>
+            </w:r>
+            <w:r>
+              <w:t xml:space="preserve">Bar</w:t>
+            </w:r>
+            <w:r>
+              <w:t xml:space="preserve"> </w:t>
+            </w:r>
+            <w:r>
+              <w:t xml:space="preserve">No.</w:t>
+            </w:r>
+            <w:r>
+              <w:t xml:space="preserve"> </w:t>
+            </w:r>
+            <w:r>
+              <w:t xml:space="preserve">462924</w:t>
+            </w:r>
+          </w:p>
+          <w:p>
+            <w:pPr>
+              <w:spacing w:before="0" w:after="0" w:line="276" w:lineRule="exact"/>
+              <w:ind w:left="0" w:firstLine="0"/>
+              <w:jc w:val="left"/>
+            </w:pPr>
+            <w:r>
+              <w:t xml:space="preserve">fmacchiaverna@huntermaclean.com</w:t>
+            </w:r>
+          </w:p>
+          <w:p>
+            <w:pPr>
+              <w:spacing w:before="240" w:after="0" w:line="276" w:lineRule="exact"/>
+              <w:ind w:left="0" w:firstLine="0"/>
+              <w:jc w:val="left"/>
+            </w:pPr>
+            <w:r>
+              <w:t xml:space="preserve">Robert</w:t>
+            </w:r>
+            <w:r>
+              <w:t xml:space="preserve"> </w:t>
+            </w:r>
+            <w:r>
+              <w:t xml:space="preserve">Hurst</w:t>
+            </w:r>
+          </w:p>
+          <w:p>
+            <w:pPr>
+              <w:spacing w:before="0" w:after="0" w:line="276" w:lineRule="exact"/>
+              <w:ind w:left="0" w:firstLine="0"/>
+              <w:jc w:val="left"/>
+            </w:pPr>
+            <w:r>
+              <w:t xml:space="preserve">Georgia</w:t>
+            </w:r>
+            <w:r>
+              <w:t xml:space="preserve"> </w:t>
+            </w:r>
+            <w:r>
+              <w:t xml:space="preserve">Bar</w:t>
+            </w:r>
+            <w:r>
+              <w:t xml:space="preserve"> </w:t>
+            </w:r>
+            <w:r>
+              <w:t xml:space="preserve">No.</w:t>
+            </w:r>
+            <w:r>
+              <w:t xml:space="preserve"> </w:t>
+            </w:r>
+            <w:r>
+              <w:t xml:space="preserve">919180</w:t>
+            </w:r>
+          </w:p>
+          <w:p>
+            <w:pPr>
+              <w:spacing w:before="0" w:after="0" w:line="276" w:lineRule="exact"/>
+              <w:ind w:left="0" w:firstLine="0"/>
+              <w:jc w:val="left"/>
+            </w:pPr>
+            <w:r>
+              <w:t xml:space="preserve">rhurst@huntermclean.com</w:t>
+            </w:r>
+          </w:p>
+          <w:p>
+            <w:pPr>
+              <w:spacing w:before="0" w:after="0" w:line="276" w:lineRule="exact"/>
+              <w:ind w:left="0" w:firstLine="0"/>
+              <w:jc w:val="left"/>
+            </w:pPr>
+            <w:r>
+              <w:t xml:space="preserve">Luckshume</w:t>
+            </w:r>
+            <w:r>
+              <w:t xml:space="preserve"> </w:t>
+            </w:r>
+            <w:r>
+              <w:t xml:space="preserve">Ketheeswaran</w:t>
+            </w:r>
+          </w:p>
+          <w:p>
+            <w:pPr>
+              <w:spacing w:before="0" w:after="0" w:line="276" w:lineRule="exact"/>
+              <w:ind w:left="0" w:firstLine="0"/>
+              <w:jc w:val="left"/>
+            </w:pPr>
+            <w:r>
+              <w:t xml:space="preserve">Georgia</w:t>
+            </w:r>
+            <w:r>
+              <w:t xml:space="preserve"> </w:t>
+            </w:r>
+            <w:r>
+              <w:t xml:space="preserve">Bar</w:t>
+            </w:r>
+            <w:r>
+              <w:t xml:space="preserve"> </w:t>
+            </w:r>
+            <w:r>
+              <w:t xml:space="preserve">No.</w:t>
+            </w:r>
+            <w:r>
+              <w:t xml:space="preserve"> </w:t>
+            </w:r>
+            <w:r>
+              <w:t xml:space="preserve">981388</w:t>
+            </w:r>
+          </w:p>
+          <w:p>
+            <w:pPr>
+              <w:spacing w:before="0" w:after="0" w:line="276" w:lineRule="exact"/>
+              <w:ind w:left="0" w:firstLine="0"/>
+              <w:jc w:val="left"/>
+            </w:pPr>
+            <w:r>
+              <w:t xml:space="preserve">lketheeswaran@huntermaclean.com</w:t>
+            </w:r>
+          </w:p>
+          <w:p>
+            <w:pPr>
+              <w:spacing w:before="240" w:after="0" w:line="276" w:lineRule="exact"/>
+              <w:ind w:left="0" w:firstLine="0"/>
+              <w:jc w:val="left"/>
             </w:pPr>
             <w:r>
               <w:rPr>
@@ -1766,9 +2347,13 @@
               </w:rPr>
               <w:t xml:space="preserve">LLC</w:t>
             </w:r>
-            <w:r>
-              <w:br/>
-            </w:r>
+          </w:p>
+          <w:p>
+            <w:pPr>
+              <w:spacing w:before="0" w:after="0" w:line="276" w:lineRule="exact"/>
+              <w:ind w:left="0" w:firstLine="0"/>
+              <w:jc w:val="left"/>
+            </w:pPr>
             <w:r>
               <w:t xml:space="preserve">P.O.</w:t>
             </w:r>
@@ -1784,9 +2369,13 @@
             <w:r>
               <w:t xml:space="preserve">9848</w:t>
             </w:r>
-            <w:r>
-              <w:br/>
-            </w:r>
+          </w:p>
+          <w:p>
+            <w:pPr>
+              <w:spacing w:before="0" w:after="0" w:line="276" w:lineRule="exact"/>
+              <w:ind w:left="0" w:firstLine="0"/>
+              <w:jc w:val="left"/>
+            </w:pPr>
             <w:r>
               <w:t xml:space="preserve">Savannah,</w:t>
             </w:r>
@@ -1800,11 +2389,17 @@
               <w:t xml:space="preserve"> </w:t>
             </w:r>
             <w:r>
-              <w:t xml:space="preserve">31412-0048</w:t>
-            </w:r>
-            <w:r>
-              <w:br/>
-            </w:r>
+              <w:t xml:space="preserve">31412</w:t>
+              <w:noBreakHyphen/>
+              <w:t xml:space="preserve">0048</w:t>
+            </w:r>
+          </w:p>
+          <w:p>
+            <w:pPr>
+              <w:spacing w:before="0" w:after="0" w:line="276" w:lineRule="exact"/>
+              <w:ind w:left="0" w:firstLine="0"/>
+              <w:jc w:val="left"/>
+            </w:pPr>
             <w:r>
               <w:t xml:space="preserve">(912)</w:t>
             </w:r>
@@ -1812,7 +2407,9 @@
               <w:t xml:space="preserve"> </w:t>
             </w:r>
             <w:r>
-              <w:t xml:space="preserve">236-0261</w:t>
+              <w:t xml:space="preserve">236</w:t>
+              <w:noBreakHyphen/>
+              <w:t xml:space="preserve">0261</w:t>
             </w:r>
           </w:p>
         </w:tc>
@@ -1820,11 +2417,8 @@
     </w:tbl>
     <w:sectPr>
       <w:footerReference w:type="default" r:id="rIdFooter1"/>
-      <w:footnotePr>
-        <w:numRestart w:val="eachSect"/>
-      </w:footnotePr>
       <w:pgSz w:w="12240" w:h="15840"/>
-      <w:pgMar w:top="1440" w:right="1440" w:bottom="1440" w:left="1440" w:header="720" w:footer="720" w:gutter="0"/>
+      <w:pgMar w:top="1440" w:right="1440" w:bottom="1440" w:left="1440" w:header="720" w:footer="735" w:gutter="0"/>
     </w:sectPr>
   </w:body>
 </w:document>
@@ -1838,6 +2432,7 @@
 <w:ftr xmlns:w="http://schemas.openxmlformats.org/wordprocessingml/2006/main" xmlns:r="http://schemas.openxmlformats.org/officeDocument/2006/relationships">
   <w:p>
     <w:pPr>
+      <w:spacing w:before="0" w:after="0" w:line="276" w:lineRule="exact"/>
       <w:jc w:val="center"/>
     </w:pPr>
     <w:r>
@@ -1895,7 +2490,7 @@
       </w:r>
     </w:p>
   </w:footnote>
-  <w:footnote w:id="12">
+  <w:footnote w:id="9">
     <w:p>
       <w:pPr>
         <w:pStyle w:val="FootnoteText"/>
@@ -2006,51 +2601,46 @@
   <w:docDefaults>
     <w:rPrDefault>
       <w:rPr>
-        <w:rFonts w:ascii="EB Garamond" w:hAnsi="EB Garamond" w:eastAsia="EB Garamond" w:cs="EB Garamond"/>
-        <w:sz w:val="26"/>
-        <w:szCs w:val="26"/>
+        <w:rFonts w:ascii="Times New Roman" w:hAnsi="Times New Roman" w:eastAsia="Times New Roman" w:cs="Times New Roman"/>
+        <w:sz w:val="24"/>
+        <w:szCs w:val="24"/>
         <w:lang w:val="en-US" w:eastAsia="zh-CN" w:bidi="ar-SA"/>
       </w:rPr>
     </w:rPrDefault>
     <w:pPrDefault>
       <w:pPr>
+        <w:widowControl/>
         <w:spacing w:after="0"/>
       </w:pPr>
     </w:pPrDefault>
   </w:docDefaults>
   <w:latentStyles w:defLockedState="0" w:defUIPriority="0" w:defSemiHidden="0" w:defUnhideWhenUsed="0" w:defQFormat="0" w:count="276"/>
-  <w:style w:type="paragraph" w:styleId="Normal">
+  <w:style w:type="paragraph" w:default="1" w:styleId="Normal">
     <w:name w:val="Normal"/>
     <w:qFormat/>
-    <w:pPr>
-      <w:spacing w:before="0" w:after="0" w:line="240" w:lineRule="auto"/>
-    </w:pPr>
   </w:style>
   <w:style w:type="paragraph" w:styleId="BodyText">
-    <w:name w:val="BodyText"/>
+    <w:name w:val="Body Text"/>
     <w:basedOn w:val="Normal"/>
+    <w:link w:val="BodyTextChar"/>
     <w:qFormat/>
     <w:pPr>
       <w:spacing w:before="0" w:after="0" w:line="480" w:lineRule="exact"/>
       <w:ind w:firstLine="720"/>
     </w:pPr>
   </w:style>
-  <w:style w:type="paragraph" w:styleId="FirstParagraph">
-    <w:name w:val="FirstParagraph"/>
-    <w:basedOn w:val="Normal"/>
+  <w:style w:type="paragraph" w:customStyle="1" w:styleId="FirstParagraph">
+    <w:name w:val="First Paragraph"/>
+    <w:basedOn w:val="BodyText"/>
+    <w:next w:val="BodyText"/>
+    <w:qFormat/>
+  </w:style>
+  <w:style w:type="paragraph" w:customStyle="1" w:styleId="Compact">
+    <w:name w:val="Compact"/>
+    <w:basedOn w:val="BodyText"/>
     <w:qFormat/>
     <w:pPr>
-      <w:spacing w:before="0" w:after="0" w:line="480" w:lineRule="exact"/>
-      <w:ind w:firstLine="720"/>
-    </w:pPr>
-  </w:style>
-  <w:style w:type="paragraph" w:styleId="Compact">
-    <w:name w:val="Compact"/>
-    <w:basedOn w:val="Normal"/>
-    <w:qFormat/>
-    <w:pPr>
-      <w:spacing w:before="0" w:after="0" w:line="480" w:lineRule="exact"/>
-      <w:ind w:firstLine="720"/>
+      <w:spacing w:before="36" w:after="36"/>
     </w:pPr>
   </w:style>
   <w:style w:type="paragraph" w:styleId="Title">
@@ -2190,198 +2780,220 @@
     <w:name w:val="heading 1"/>
     <w:basedOn w:val="Normal"/>
     <w:next w:val="BodyText"/>
+    <w:link w:val="Heading1Char"/>
     <w:uiPriority w:val="9"/>
     <w:qFormat/>
+    <w:rsid w:val="00A10FD9"/>
     <w:pPr>
       <w:keepNext/>
       <w:keepLines/>
-      <w:spacing w:before="240" w:after="240" w:line="240" w:lineRule="auto"/>
+      <w:spacing w:before="240" w:after="240" w:line="276" w:lineRule="exact"/>
       <w:ind w:firstLine="0"/>
       <w:jc w:val="center"/>
       <w:outlineLvl w:val="0"/>
     </w:pPr>
     <w:rPr>
+      <w:rFonts w:ascii="Times New Roman" w:hAnsi="Times New Roman" w:eastAsia="Times New Roman" w:cs="Times New Roman"/>
       <w:b/>
       <w:bCs/>
+      <w:caps/>
       <w:color w:val="000000"/>
-      <w:sz w:val="26"/>
-      <w:szCs w:val="26"/>
+      <w:sz w:val="24"/>
+      <w:szCs w:val="24"/>
     </w:rPr>
   </w:style>
   <w:style w:type="paragraph" w:styleId="Heading2">
     <w:name w:val="heading 2"/>
     <w:basedOn w:val="Normal"/>
     <w:next w:val="BodyText"/>
+    <w:link w:val="Heading2Char"/>
     <w:uiPriority w:val="9"/>
+    <w:semiHidden/>
+    <w:unhideWhenUsed/>
     <w:qFormat/>
+    <w:rsid w:val="00A10FD9"/>
     <w:pPr>
       <w:keepNext/>
       <w:keepLines/>
-      <w:spacing w:before="240" w:after="240" w:line="240" w:lineRule="auto"/>
+      <w:spacing w:before="240" w:after="240" w:line="276" w:lineRule="exact"/>
       <w:ind w:firstLine="0"/>
-      <w:jc w:val="center"/>
       <w:outlineLvl w:val="1"/>
     </w:pPr>
     <w:rPr>
+      <w:rFonts w:ascii="Times New Roman" w:hAnsi="Times New Roman" w:eastAsia="Times New Roman" w:cs="Times New Roman"/>
       <w:b/>
       <w:bCs/>
       <w:color w:val="000000"/>
-      <w:sz w:val="26"/>
-      <w:szCs w:val="26"/>
+      <w:sz w:val="24"/>
+      <w:szCs w:val="24"/>
     </w:rPr>
   </w:style>
   <w:style w:type="paragraph" w:styleId="Heading3">
     <w:name w:val="heading 3"/>
     <w:basedOn w:val="Normal"/>
     <w:next w:val="BodyText"/>
+    <w:link w:val="Heading3Char"/>
     <w:uiPriority w:val="9"/>
+    <w:semiHidden/>
+    <w:unhideWhenUsed/>
     <w:qFormat/>
+    <w:rsid w:val="00A10FD9"/>
     <w:pPr>
       <w:keepNext/>
       <w:keepLines/>
-      <w:spacing w:before="240" w:after="240" w:line="240" w:lineRule="auto"/>
+      <w:spacing w:before="240" w:after="240" w:line="276" w:lineRule="exact"/>
       <w:ind w:firstLine="0"/>
-      <w:jc w:val="center"/>
       <w:outlineLvl w:val="2"/>
     </w:pPr>
     <w:rPr>
+      <w:rFonts w:ascii="Times New Roman" w:hAnsi="Times New Roman" w:eastAsia="Times New Roman" w:cs="Times New Roman"/>
       <w:b/>
       <w:bCs/>
       <w:color w:val="000000"/>
-      <w:sz w:val="26"/>
-      <w:szCs w:val="26"/>
+      <w:sz w:val="24"/>
+      <w:szCs w:val="24"/>
     </w:rPr>
   </w:style>
   <w:style w:type="paragraph" w:styleId="Heading4">
     <w:name w:val="heading 4"/>
     <w:basedOn w:val="Normal"/>
     <w:next w:val="BodyText"/>
+    <w:link w:val="Heading4Char"/>
     <w:uiPriority w:val="9"/>
+    <w:semiHidden/>
+    <w:unhideWhenUsed/>
     <w:qFormat/>
+    <w:rsid w:val="00A10FD9"/>
     <w:pPr>
       <w:keepNext/>
       <w:keepLines/>
-      <w:spacing w:before="240" w:after="240" w:line="240" w:lineRule="auto"/>
+      <w:spacing w:before="240" w:after="240" w:line="276" w:lineRule="exact"/>
       <w:ind w:firstLine="0"/>
-      <w:jc w:val="center"/>
       <w:outlineLvl w:val="3"/>
     </w:pPr>
     <w:rPr>
+      <w:rFonts w:ascii="Times New Roman" w:hAnsi="Times New Roman" w:eastAsia="Times New Roman" w:cs="Times New Roman"/>
       <w:b/>
       <w:bCs/>
+      <w:i/>
       <w:color w:val="000000"/>
-      <w:sz w:val="26"/>
-      <w:szCs w:val="26"/>
+      <w:sz w:val="24"/>
+      <w:szCs w:val="24"/>
     </w:rPr>
   </w:style>
   <w:style w:type="paragraph" w:styleId="Heading5">
     <w:name w:val="heading 5"/>
     <w:basedOn w:val="Normal"/>
     <w:next w:val="BodyText"/>
+    <w:link w:val="Heading5Char"/>
     <w:uiPriority w:val="9"/>
+    <w:semiHidden/>
+    <w:unhideWhenUsed/>
     <w:qFormat/>
+    <w:rsid w:val="00A10FD9"/>
     <w:pPr>
       <w:keepNext/>
       <w:keepLines/>
-      <w:spacing w:before="240" w:after="240" w:line="240" w:lineRule="auto"/>
+      <w:spacing w:before="240" w:after="240" w:line="276" w:lineRule="exact"/>
       <w:ind w:firstLine="0"/>
-      <w:jc w:val="center"/>
       <w:outlineLvl w:val="4"/>
     </w:pPr>
     <w:rPr>
+      <w:rFonts w:ascii="Times New Roman" w:hAnsi="Times New Roman" w:eastAsia="Times New Roman" w:cs="Times New Roman"/>
       <w:b/>
       <w:bCs/>
+      <w:i/>
       <w:color w:val="000000"/>
-      <w:sz w:val="26"/>
-      <w:szCs w:val="26"/>
+      <w:sz w:val="24"/>
+      <w:szCs w:val="24"/>
     </w:rPr>
   </w:style>
   <w:style w:type="paragraph" w:styleId="Heading6">
     <w:name w:val="heading 6"/>
     <w:basedOn w:val="Normal"/>
     <w:next w:val="BodyText"/>
+    <w:link w:val="Heading6Char"/>
     <w:uiPriority w:val="9"/>
+    <w:semiHidden/>
+    <w:unhideWhenUsed/>
     <w:qFormat/>
+    <w:rsid w:val="00A10FD9"/>
     <w:pPr>
       <w:keepNext/>
       <w:keepLines/>
-      <w:spacing w:before="240" w:after="240" w:line="240" w:lineRule="auto"/>
-      <w:ind w:firstLine="0"/>
-      <w:jc w:val="center"/>
+      <w:spacing w:before="40" w:after="0"/>
       <w:outlineLvl w:val="5"/>
     </w:pPr>
     <w:rPr>
-      <w:b/>
-      <w:bCs/>
-      <w:color w:val="000000"/>
-      <w:sz w:val="26"/>
-      <w:szCs w:val="26"/>
+      <w:rFonts w:eastAsiaTheme="majorEastAsia" w:cstheme="majorBidi"/>
+      <w:i/>
+      <w:iCs/>
+      <w:color w:val="595959" w:themeColor="text1" w:themeTint="A6"/>
     </w:rPr>
   </w:style>
   <w:style w:type="paragraph" w:styleId="Heading7">
     <w:name w:val="heading 7"/>
     <w:basedOn w:val="Normal"/>
     <w:next w:val="BodyText"/>
+    <w:link w:val="Heading7Char"/>
     <w:uiPriority w:val="9"/>
+    <w:semiHidden/>
+    <w:unhideWhenUsed/>
     <w:qFormat/>
+    <w:rsid w:val="00A10FD9"/>
     <w:pPr>
       <w:keepNext/>
       <w:keepLines/>
-      <w:spacing w:before="240" w:after="240" w:line="240" w:lineRule="auto"/>
-      <w:ind w:firstLine="0"/>
-      <w:jc w:val="center"/>
+      <w:spacing w:before="40" w:after="0"/>
       <w:outlineLvl w:val="6"/>
     </w:pPr>
     <w:rPr>
-      <w:b/>
-      <w:bCs/>
-      <w:color w:val="000000"/>
-      <w:sz w:val="26"/>
-      <w:szCs w:val="26"/>
+      <w:rFonts w:eastAsiaTheme="majorEastAsia" w:cstheme="majorBidi"/>
+      <w:color w:val="595959" w:themeColor="text1" w:themeTint="A6"/>
     </w:rPr>
   </w:style>
   <w:style w:type="paragraph" w:styleId="Heading8">
     <w:name w:val="heading 8"/>
     <w:basedOn w:val="Normal"/>
     <w:next w:val="BodyText"/>
+    <w:link w:val="Heading8Char"/>
     <w:uiPriority w:val="9"/>
+    <w:semiHidden/>
+    <w:unhideWhenUsed/>
     <w:qFormat/>
+    <w:rsid w:val="00A10FD9"/>
     <w:pPr>
       <w:keepNext/>
       <w:keepLines/>
-      <w:spacing w:before="240" w:after="240" w:line="240" w:lineRule="auto"/>
-      <w:ind w:firstLine="0"/>
-      <w:jc w:val="center"/>
+      <w:spacing w:after="0"/>
       <w:outlineLvl w:val="7"/>
     </w:pPr>
     <w:rPr>
-      <w:b/>
-      <w:bCs/>
-      <w:color w:val="000000"/>
-      <w:sz w:val="26"/>
-      <w:szCs w:val="26"/>
+      <w:rFonts w:eastAsiaTheme="majorEastAsia" w:cstheme="majorBidi"/>
+      <w:i/>
+      <w:iCs/>
+      <w:color w:val="272727" w:themeColor="text1" w:themeTint="D8"/>
     </w:rPr>
   </w:style>
   <w:style w:type="paragraph" w:styleId="Heading9">
     <w:name w:val="heading 9"/>
     <w:basedOn w:val="Normal"/>
     <w:next w:val="BodyText"/>
+    <w:link w:val="Heading9Char"/>
     <w:uiPriority w:val="9"/>
+    <w:semiHidden/>
+    <w:unhideWhenUsed/>
     <w:qFormat/>
+    <w:rsid w:val="00A10FD9"/>
     <w:pPr>
       <w:keepNext/>
       <w:keepLines/>
-      <w:spacing w:before="240" w:after="240" w:line="240" w:lineRule="auto"/>
-      <w:ind w:firstLine="0"/>
-      <w:jc w:val="center"/>
+      <w:spacing w:after="0"/>
       <w:outlineLvl w:val="8"/>
     </w:pPr>
     <w:rPr>
-      <w:b/>
-      <w:bCs/>
-      <w:color w:val="000000"/>
-      <w:sz w:val="26"/>
-      <w:szCs w:val="26"/>
+      <w:rFonts w:eastAsiaTheme="majorEastAsia" w:cstheme="majorBidi"/>
+      <w:color w:val="272727" w:themeColor="text1" w:themeTint="D8"/>
     </w:rPr>
   </w:style>
   <w:style w:type="character" w:customStyle="1" w:styleId="Heading1Char">
@@ -2503,26 +3115,41 @@
       <w:color w:val="272727" w:themeColor="text1" w:themeTint="D8"/>
     </w:rPr>
   </w:style>
-  <w:style w:type="paragraph" w:styleId="BlockText">
-    <w:name w:val="BlockText"/>
-    <w:basedOn w:val="Normal"/>
+  <w:style w:type="paragraph" w:customStyle="1" w:styleId="ListItem">
+    <w:name w:val="List Item"/>
+    <w:basedOn w:val="BodyText"/>
     <w:qFormat/>
     <w:pPr>
-      <w:spacing w:before="240" w:after="240" w:line="240" w:lineRule="auto"/>
-      <w:ind w:left="720" w:right="720" w:firstLine="0"/>
+      <w:spacing w:before="0" w:after="0" w:line="480" w:lineRule="exact"/>
+      <w:ind w:left="720" w:hanging="720"/>
     </w:pPr>
   </w:style>
-  <w:style w:type="paragraph" w:styleId="FootnoteText">
-    <w:name w:val="FootnoteText"/>
-    <w:basedOn w:val="Normal"/>
+  <w:style w:type="paragraph" w:styleId="BlockText">
+    <w:name w:val="Block Text"/>
+    <w:basedOn w:val="BodyText"/>
+    <w:next w:val="BodyText"/>
+    <w:uiPriority w:val="9"/>
+    <w:unhideWhenUsed/>
     <w:qFormat/>
     <w:pPr>
-      <w:spacing w:before="0" w:after="104" w:line="240" w:lineRule="auto"/>
-      <w:ind w:firstLine="0"/>
+      <w:spacing w:before="280" w:after="280" w:line="276" w:lineRule="exact"/>
+      <w:ind w:firstLine="0" w:left="720" w:right="720"/>
     </w:pPr>
-    <w:rPr>
-      <w:sz w:val="26"/>
-      <w:szCs w:val="26"/>
+  </w:style>
+  <w:style w:type="paragraph" w:styleId="FootnoteText">
+    <w:name w:val="Footnote Text"/>
+    <w:basedOn w:val="Normal"/>
+    <w:next w:val="FootnoteText"/>
+    <w:uiPriority w:val="9"/>
+    <w:unhideWhenUsed/>
+    <w:qFormat/>
+    <w:pPr>
+      <w:keepLines/>
+      <w:spacing w:before="0" w:after="140" w:line="276" w:lineRule="exact"/>
+    </w:pPr>
+    <w:rPr>
+      <w:sz w:val="24"/>
+      <w:szCs w:val="24"/>
     </w:rPr>
   </w:style>
   <w:style w:type="paragraph" w:styleId="FootnoteBlockText">
@@ -2533,8 +3160,8 @@
     <w:unhideWhenUsed/>
     <w:qFormat/>
     <w:pPr>
-      <w:spacing w:before="100" w:after="100"/>
-      <w:ind w:firstLine="0" w:left="480" w:right="480"/>
+      <w:spacing w:before="280" w:after="280"/>
+      <w:ind w:firstLine="0" w:left="720" w:right="720"/>
     </w:pPr>
   </w:style>
   <w:style w:type="character" w:default="1" w:styleId="DefaultParagraphFont">
@@ -2642,7 +3269,7 @@
     <w:name w:val="Hyperlink"/>
     <w:basedOn w:val="BodyTextChar"/>
     <w:rPr>
-      <w:color w:val="4F81BD" w:themeColor="accent1"/>
+      <w:color w:val="000000"/>
     </w:rPr>
   </w:style>
   <w:style w:type="paragraph" w:styleId="TOCHeading">
@@ -2663,13 +3290,12 @@
       <w:color w:val="365F91" w:themeColor="accent1" w:themeShade="BF"/>
     </w:rPr>
   </w:style>
-  <w:style w:type="paragraph" w:customStyle="1" w:styleId="NumberedParagraph">
-    <w:name w:val="Numbered Paragraph"/>
-    <w:basedOn w:val="Normal"/>
+  <w:style w:type="paragraph" w:customStyle="1" w:styleId="BodyTextNote">
+    <w:name w:val="Body Text Note"/>
+    <w:basedOn w:val="BodyText"/>
     <w:qFormat/>
     <w:pPr>
-      <w:spacing w:before="0" w:after="0" w:line="480" w:lineRule="exact"/>
-      <w:ind w:left="1080" w:hanging="360"/>
+      <w:widowControl w:val="0"/>
     </w:pPr>
   </w:style>
   <w:style w:type="paragraph" w:customStyle="1" w:styleId="SourceCode">

</xml_diff>